<commit_message>
feat: EndPoint listado de solicitudes con filtros
</commit_message>
<xml_diff>
--- a/MesaSitecpro.docx
+++ b/MesaSitecpro.docx
@@ -47,8 +47,18 @@
           <w:b/>
           <w:bCs/>
         </w:rPr>
-        <w:t>Mesa de servicio - Multiorganización</w:t>
-      </w:r>
+        <w:t xml:space="preserve">Mesa de servicio - </w:t>
+      </w:r>
+      <w:proofErr w:type="spellStart"/>
+      <w:r>
+        <w:rPr>
+          <w:rFonts w:ascii="Arial" w:hAnsi="Arial" w:cs="Arial"/>
+          <w:b/>
+          <w:bCs/>
+        </w:rPr>
+        <w:t>Multiorganización</w:t>
+      </w:r>
+      <w:proofErr w:type="spellEnd"/>
     </w:p>
     <w:p>
       <w:pPr>
@@ -100,13 +110,35 @@
         <w:rPr>
           <w:rFonts w:ascii="Arial" w:hAnsi="Arial" w:cs="Arial"/>
         </w:rPr>
-        <w:t>4 Tablas</w:t>
-      </w:r>
-      <w:r>
-        <w:rPr>
-          <w:rFonts w:ascii="Arial" w:hAnsi="Arial" w:cs="Arial"/>
-        </w:rPr>
-        <w:t xml:space="preserve"> – 9 Endpoints – 4 pantallas</w:t>
+        <w:t xml:space="preserve">4 </w:t>
+      </w:r>
+      <w:proofErr w:type="gramStart"/>
+      <w:r>
+        <w:rPr>
+          <w:rFonts w:ascii="Arial" w:hAnsi="Arial" w:cs="Arial"/>
+        </w:rPr>
+        <w:t>Tablas</w:t>
+      </w:r>
+      <w:proofErr w:type="gramEnd"/>
+      <w:r>
+        <w:rPr>
+          <w:rFonts w:ascii="Arial" w:hAnsi="Arial" w:cs="Arial"/>
+        </w:rPr>
+        <w:t xml:space="preserve"> – 9 </w:t>
+      </w:r>
+      <w:proofErr w:type="spellStart"/>
+      <w:r>
+        <w:rPr>
+          <w:rFonts w:ascii="Arial" w:hAnsi="Arial" w:cs="Arial"/>
+        </w:rPr>
+        <w:t>Endpoints</w:t>
+      </w:r>
+      <w:proofErr w:type="spellEnd"/>
+      <w:r>
+        <w:rPr>
+          <w:rFonts w:ascii="Arial" w:hAnsi="Arial" w:cs="Arial"/>
+        </w:rPr>
+        <w:t xml:space="preserve"> – 4 pantallas</w:t>
       </w:r>
     </w:p>
     <w:p>
@@ -156,7 +188,21 @@
         <w:rPr>
           <w:rFonts w:ascii="Arial" w:hAnsi="Arial" w:cs="Arial"/>
         </w:rPr>
-        <w:t>Realizar un Readme para levantar el proyecto, en menos de 5 minutos.</w:t>
+        <w:t xml:space="preserve">Realizar un </w:t>
+      </w:r>
+      <w:proofErr w:type="spellStart"/>
+      <w:r>
+        <w:rPr>
+          <w:rFonts w:ascii="Arial" w:hAnsi="Arial" w:cs="Arial"/>
+        </w:rPr>
+        <w:t>Readme</w:t>
+      </w:r>
+      <w:proofErr w:type="spellEnd"/>
+      <w:r>
+        <w:rPr>
+          <w:rFonts w:ascii="Arial" w:hAnsi="Arial" w:cs="Arial"/>
+        </w:rPr>
+        <w:t xml:space="preserve"> para levantar el proyecto, en menos de 5 minutos.</w:t>
       </w:r>
     </w:p>
     <w:p>
@@ -178,6 +224,7 @@
         </w:rPr>
         <w:t xml:space="preserve">El modelo SaaS, no es vender tu proyecto sino pagar una cierta suscripción en el mundo SaaS al que paga la suscripción se le llama </w:t>
       </w:r>
+      <w:proofErr w:type="spellStart"/>
       <w:r>
         <w:rPr>
           <w:rFonts w:ascii="Arial" w:hAnsi="Arial" w:cs="Arial"/>
@@ -186,6 +233,7 @@
         </w:rPr>
         <w:t>tenants</w:t>
       </w:r>
+      <w:proofErr w:type="spellEnd"/>
       <w:r>
         <w:rPr>
           <w:rFonts w:ascii="Arial" w:hAnsi="Arial" w:cs="Arial"/>
@@ -272,7 +320,21 @@
         <w:rPr>
           <w:rFonts w:ascii="Arial" w:hAnsi="Arial" w:cs="Arial"/>
         </w:rPr>
-        <w:t>Idea dos, con un login vamos a dar acceso a los productos por organización.</w:t>
+        <w:t xml:space="preserve">Idea dos, con un </w:t>
+      </w:r>
+      <w:proofErr w:type="spellStart"/>
+      <w:r>
+        <w:rPr>
+          <w:rFonts w:ascii="Arial" w:hAnsi="Arial" w:cs="Arial"/>
+        </w:rPr>
+        <w:t>login</w:t>
+      </w:r>
+      <w:proofErr w:type="spellEnd"/>
+      <w:r>
+        <w:rPr>
+          <w:rFonts w:ascii="Arial" w:hAnsi="Arial" w:cs="Arial"/>
+        </w:rPr>
+        <w:t xml:space="preserve"> vamos a dar acceso a los productos por organización.</w:t>
       </w:r>
     </w:p>
     <w:p>
@@ -446,6 +508,7 @@
                 <w14:ligatures w14:val="none"/>
               </w:rPr>
             </w:pPr>
+            <w:proofErr w:type="spellStart"/>
             <w:r>
               <w:rPr>
                 <w:rFonts w:ascii="Arial" w:eastAsia="Times New Roman" w:hAnsi="Arial" w:cs="Arial"/>
@@ -458,6 +521,7 @@
               </w:rPr>
               <w:t>tenant</w:t>
             </w:r>
+            <w:proofErr w:type="spellEnd"/>
           </w:p>
         </w:tc>
       </w:tr>
@@ -539,6 +603,7 @@
                 <w14:ligatures w14:val="none"/>
               </w:rPr>
             </w:pPr>
+            <w:proofErr w:type="spellStart"/>
             <w:r>
               <w:rPr>
                 <w:rFonts w:ascii="Arial" w:eastAsia="Times New Roman" w:hAnsi="Arial" w:cs="Arial"/>
@@ -549,6 +614,7 @@
               </w:rPr>
               <w:t>guid</w:t>
             </w:r>
+            <w:proofErr w:type="spellEnd"/>
           </w:p>
         </w:tc>
       </w:tr>
@@ -620,6 +686,7 @@
                 <w14:ligatures w14:val="none"/>
               </w:rPr>
             </w:pPr>
+            <w:proofErr w:type="spellStart"/>
             <w:r>
               <w:rPr>
                 <w:rFonts w:ascii="Arial" w:eastAsia="Times New Roman" w:hAnsi="Arial" w:cs="Arial"/>
@@ -630,6 +697,7 @@
               </w:rPr>
               <w:t>string</w:t>
             </w:r>
+            <w:proofErr w:type="spellEnd"/>
           </w:p>
         </w:tc>
       </w:tr>
@@ -701,6 +769,7 @@
                 <w14:ligatures w14:val="none"/>
               </w:rPr>
             </w:pPr>
+            <w:proofErr w:type="spellStart"/>
             <w:r>
               <w:rPr>
                 <w:rFonts w:ascii="Arial" w:eastAsia="Times New Roman" w:hAnsi="Arial" w:cs="Arial"/>
@@ -711,6 +780,7 @@
               </w:rPr>
               <w:t>boolean</w:t>
             </w:r>
+            <w:proofErr w:type="spellEnd"/>
           </w:p>
         </w:tc>
       </w:tr>
@@ -843,6 +913,7 @@
                 <w14:ligatures w14:val="none"/>
               </w:rPr>
             </w:pPr>
+            <w:proofErr w:type="spellStart"/>
             <w:r>
               <w:rPr>
                 <w:rFonts w:ascii="Arial" w:eastAsia="Times New Roman" w:hAnsi="Arial" w:cs="Arial"/>
@@ -853,6 +924,7 @@
               </w:rPr>
               <w:t>guid</w:t>
             </w:r>
+            <w:proofErr w:type="spellEnd"/>
           </w:p>
         </w:tc>
       </w:tr>
@@ -885,6 +957,7 @@
                 <w14:ligatures w14:val="none"/>
               </w:rPr>
             </w:pPr>
+            <w:proofErr w:type="spellStart"/>
             <w:r>
               <w:rPr>
                 <w:rFonts w:ascii="Arial" w:eastAsia="Times New Roman" w:hAnsi="Arial" w:cs="Arial"/>
@@ -895,6 +968,7 @@
               </w:rPr>
               <w:t>tenantId</w:t>
             </w:r>
+            <w:proofErr w:type="spellEnd"/>
           </w:p>
         </w:tc>
         <w:tc>
@@ -922,6 +996,7 @@
                 <w14:ligatures w14:val="none"/>
               </w:rPr>
             </w:pPr>
+            <w:proofErr w:type="spellStart"/>
             <w:r>
               <w:rPr>
                 <w:rFonts w:ascii="Arial" w:eastAsia="Times New Roman" w:hAnsi="Arial" w:cs="Arial"/>
@@ -932,6 +1007,7 @@
               </w:rPr>
               <w:t>guid</w:t>
             </w:r>
+            <w:proofErr w:type="spellEnd"/>
           </w:p>
         </w:tc>
       </w:tr>
@@ -1001,6 +1077,7 @@
                 <w14:ligatures w14:val="none"/>
               </w:rPr>
             </w:pPr>
+            <w:proofErr w:type="spellStart"/>
             <w:r>
               <w:rPr>
                 <w:rFonts w:ascii="Arial" w:eastAsia="Times New Roman" w:hAnsi="Arial" w:cs="Arial"/>
@@ -1011,6 +1088,7 @@
               </w:rPr>
               <w:t>boolean</w:t>
             </w:r>
+            <w:proofErr w:type="spellEnd"/>
           </w:p>
         </w:tc>
       </w:tr>
@@ -1043,6 +1121,7 @@
                 <w14:ligatures w14:val="none"/>
               </w:rPr>
             </w:pPr>
+            <w:proofErr w:type="spellStart"/>
             <w:r>
               <w:rPr>
                 <w:rFonts w:ascii="Arial" w:eastAsia="Times New Roman" w:hAnsi="Arial" w:cs="Arial"/>
@@ -1053,6 +1132,7 @@
               </w:rPr>
               <w:t>passwordHash</w:t>
             </w:r>
+            <w:proofErr w:type="spellEnd"/>
           </w:p>
         </w:tc>
         <w:tc>
@@ -1080,6 +1160,7 @@
                 <w14:ligatures w14:val="none"/>
               </w:rPr>
             </w:pPr>
+            <w:proofErr w:type="spellStart"/>
             <w:r>
               <w:rPr>
                 <w:rFonts w:ascii="Arial" w:eastAsia="Times New Roman" w:hAnsi="Arial" w:cs="Arial"/>
@@ -1090,6 +1171,7 @@
               </w:rPr>
               <w:t>string</w:t>
             </w:r>
+            <w:proofErr w:type="spellEnd"/>
           </w:p>
         </w:tc>
       </w:tr>
@@ -1159,6 +1241,7 @@
                 <w14:ligatures w14:val="none"/>
               </w:rPr>
             </w:pPr>
+            <w:proofErr w:type="spellStart"/>
             <w:r>
               <w:rPr>
                 <w:rFonts w:ascii="Arial" w:eastAsia="Times New Roman" w:hAnsi="Arial" w:cs="Arial"/>
@@ -1169,6 +1252,7 @@
               </w:rPr>
               <w:t>string</w:t>
             </w:r>
+            <w:proofErr w:type="spellEnd"/>
           </w:p>
         </w:tc>
       </w:tr>
@@ -1238,15 +1322,27 @@
                 <w14:ligatures w14:val="none"/>
               </w:rPr>
             </w:pPr>
-            <w:r>
-              <w:rPr>
-                <w:rFonts w:ascii="Arial" w:eastAsia="Times New Roman" w:hAnsi="Arial" w:cs="Arial"/>
-                <w:color w:val="000000"/>
-                <w:kern w:val="0"/>
-                <w:lang w:eastAsia="es-GT"/>
-                <w14:ligatures w14:val="none"/>
-              </w:rPr>
-              <w:t>admin - agente - solicitante</w:t>
+            <w:proofErr w:type="spellStart"/>
+            <w:r>
+              <w:rPr>
+                <w:rFonts w:ascii="Arial" w:eastAsia="Times New Roman" w:hAnsi="Arial" w:cs="Arial"/>
+                <w:color w:val="000000"/>
+                <w:kern w:val="0"/>
+                <w:lang w:eastAsia="es-GT"/>
+                <w14:ligatures w14:val="none"/>
+              </w:rPr>
+              <w:t>admin</w:t>
+            </w:r>
+            <w:proofErr w:type="spellEnd"/>
+            <w:r>
+              <w:rPr>
+                <w:rFonts w:ascii="Arial" w:eastAsia="Times New Roman" w:hAnsi="Arial" w:cs="Arial"/>
+                <w:color w:val="000000"/>
+                <w:kern w:val="0"/>
+                <w:lang w:eastAsia="es-GT"/>
+                <w14:ligatures w14:val="none"/>
+              </w:rPr>
+              <w:t xml:space="preserve"> - agente - solicitante</w:t>
             </w:r>
           </w:p>
         </w:tc>
@@ -1317,6 +1413,7 @@
                 <w14:ligatures w14:val="none"/>
               </w:rPr>
             </w:pPr>
+            <w:proofErr w:type="spellStart"/>
             <w:r>
               <w:rPr>
                 <w:rFonts w:ascii="Arial" w:eastAsia="Times New Roman" w:hAnsi="Arial" w:cs="Arial"/>
@@ -1327,6 +1424,7 @@
               </w:rPr>
               <w:t>boolean</w:t>
             </w:r>
+            <w:proofErr w:type="spellEnd"/>
           </w:p>
         </w:tc>
       </w:tr>
@@ -1397,6 +1495,7 @@
                 <w14:ligatures w14:val="none"/>
               </w:rPr>
             </w:pPr>
+            <w:proofErr w:type="spellStart"/>
             <w:r>
               <w:rPr>
                 <w:rFonts w:ascii="Arial" w:eastAsia="Times New Roman" w:hAnsi="Arial" w:cs="Arial"/>
@@ -1409,6 +1508,7 @@
               </w:rPr>
               <w:t>categoria</w:t>
             </w:r>
+            <w:proofErr w:type="spellEnd"/>
           </w:p>
         </w:tc>
       </w:tr>
@@ -1478,6 +1578,7 @@
                 <w14:ligatures w14:val="none"/>
               </w:rPr>
             </w:pPr>
+            <w:proofErr w:type="spellStart"/>
             <w:r>
               <w:rPr>
                 <w:rFonts w:ascii="Arial" w:eastAsia="Times New Roman" w:hAnsi="Arial" w:cs="Arial"/>
@@ -1488,6 +1589,7 @@
               </w:rPr>
               <w:t>guid</w:t>
             </w:r>
+            <w:proofErr w:type="spellEnd"/>
           </w:p>
         </w:tc>
       </w:tr>
@@ -1520,6 +1622,7 @@
                 <w14:ligatures w14:val="none"/>
               </w:rPr>
             </w:pPr>
+            <w:proofErr w:type="spellStart"/>
             <w:r>
               <w:rPr>
                 <w:rFonts w:ascii="Arial" w:eastAsia="Times New Roman" w:hAnsi="Arial" w:cs="Arial"/>
@@ -1530,6 +1633,7 @@
               </w:rPr>
               <w:t>tenantId</w:t>
             </w:r>
+            <w:proofErr w:type="spellEnd"/>
           </w:p>
         </w:tc>
         <w:tc>
@@ -1557,6 +1661,7 @@
                 <w14:ligatures w14:val="none"/>
               </w:rPr>
             </w:pPr>
+            <w:proofErr w:type="spellStart"/>
             <w:r>
               <w:rPr>
                 <w:rFonts w:ascii="Arial" w:eastAsia="Times New Roman" w:hAnsi="Arial" w:cs="Arial"/>
@@ -1567,6 +1672,7 @@
               </w:rPr>
               <w:t>guid</w:t>
             </w:r>
+            <w:proofErr w:type="spellEnd"/>
           </w:p>
         </w:tc>
       </w:tr>
@@ -1636,6 +1742,7 @@
                 <w14:ligatures w14:val="none"/>
               </w:rPr>
             </w:pPr>
+            <w:proofErr w:type="spellStart"/>
             <w:r>
               <w:rPr>
                 <w:rFonts w:ascii="Arial" w:eastAsia="Times New Roman" w:hAnsi="Arial" w:cs="Arial"/>
@@ -1646,6 +1753,7 @@
               </w:rPr>
               <w:t>string</w:t>
             </w:r>
+            <w:proofErr w:type="spellEnd"/>
           </w:p>
         </w:tc>
       </w:tr>
@@ -1678,6 +1786,7 @@
                 <w14:ligatures w14:val="none"/>
               </w:rPr>
             </w:pPr>
+            <w:proofErr w:type="spellStart"/>
             <w:r>
               <w:rPr>
                 <w:rFonts w:ascii="Arial" w:eastAsia="Times New Roman" w:hAnsi="Arial" w:cs="Arial"/>
@@ -1688,6 +1797,7 @@
               </w:rPr>
               <w:t>slaHoras</w:t>
             </w:r>
+            <w:proofErr w:type="spellEnd"/>
           </w:p>
         </w:tc>
         <w:tc>
@@ -1715,6 +1825,7 @@
                 <w14:ligatures w14:val="none"/>
               </w:rPr>
             </w:pPr>
+            <w:proofErr w:type="spellStart"/>
             <w:r>
               <w:rPr>
                 <w:rFonts w:ascii="Arial" w:eastAsia="Times New Roman" w:hAnsi="Arial" w:cs="Arial"/>
@@ -1725,6 +1836,7 @@
               </w:rPr>
               <w:t>int</w:t>
             </w:r>
+            <w:proofErr w:type="spellEnd"/>
           </w:p>
         </w:tc>
       </w:tr>
@@ -1794,6 +1906,7 @@
                 <w14:ligatures w14:val="none"/>
               </w:rPr>
             </w:pPr>
+            <w:proofErr w:type="spellStart"/>
             <w:r>
               <w:rPr>
                 <w:rFonts w:ascii="Arial" w:eastAsia="Times New Roman" w:hAnsi="Arial" w:cs="Arial"/>
@@ -1804,6 +1917,7 @@
               </w:rPr>
               <w:t>boolean</w:t>
             </w:r>
+            <w:proofErr w:type="spellEnd"/>
           </w:p>
         </w:tc>
       </w:tr>
@@ -1947,6 +2061,7 @@
                 <w14:ligatures w14:val="none"/>
               </w:rPr>
             </w:pPr>
+            <w:proofErr w:type="spellStart"/>
             <w:r>
               <w:rPr>
                 <w:rFonts w:ascii="Arial" w:eastAsia="Times New Roman" w:hAnsi="Arial" w:cs="Arial"/>
@@ -1957,6 +2072,7 @@
               </w:rPr>
               <w:t>guid</w:t>
             </w:r>
+            <w:proofErr w:type="spellEnd"/>
           </w:p>
         </w:tc>
         <w:tc>
@@ -2025,6 +2141,7 @@
                 <w14:ligatures w14:val="none"/>
               </w:rPr>
             </w:pPr>
+            <w:proofErr w:type="spellStart"/>
             <w:r>
               <w:rPr>
                 <w:rFonts w:ascii="Arial" w:eastAsia="Times New Roman" w:hAnsi="Arial" w:cs="Arial"/>
@@ -2035,6 +2152,7 @@
               </w:rPr>
               <w:t>tenantId</w:t>
             </w:r>
+            <w:proofErr w:type="spellEnd"/>
           </w:p>
         </w:tc>
         <w:tc>
@@ -2062,6 +2180,7 @@
                 <w14:ligatures w14:val="none"/>
               </w:rPr>
             </w:pPr>
+            <w:proofErr w:type="spellStart"/>
             <w:r>
               <w:rPr>
                 <w:rFonts w:ascii="Arial" w:eastAsia="Times New Roman" w:hAnsi="Arial" w:cs="Arial"/>
@@ -2072,6 +2191,7 @@
               </w:rPr>
               <w:t>guid</w:t>
             </w:r>
+            <w:proofErr w:type="spellEnd"/>
           </w:p>
         </w:tc>
         <w:tc>
@@ -2140,6 +2260,7 @@
                 <w14:ligatures w14:val="none"/>
               </w:rPr>
             </w:pPr>
+            <w:proofErr w:type="spellStart"/>
             <w:r>
               <w:rPr>
                 <w:rFonts w:ascii="Arial" w:eastAsia="Times New Roman" w:hAnsi="Arial" w:cs="Arial"/>
@@ -2150,6 +2271,7 @@
               </w:rPr>
               <w:t>codigo</w:t>
             </w:r>
+            <w:proofErr w:type="spellEnd"/>
           </w:p>
         </w:tc>
         <w:tc>
@@ -2177,6 +2299,7 @@
                 <w14:ligatures w14:val="none"/>
               </w:rPr>
             </w:pPr>
+            <w:proofErr w:type="spellStart"/>
             <w:r>
               <w:rPr>
                 <w:rFonts w:ascii="Arial" w:eastAsia="Times New Roman" w:hAnsi="Arial" w:cs="Arial"/>
@@ -2187,6 +2310,7 @@
               </w:rPr>
               <w:t>string</w:t>
             </w:r>
+            <w:proofErr w:type="spellEnd"/>
           </w:p>
         </w:tc>
         <w:tc>
@@ -2293,6 +2417,7 @@
                 <w14:ligatures w14:val="none"/>
               </w:rPr>
             </w:pPr>
+            <w:proofErr w:type="spellStart"/>
             <w:r>
               <w:rPr>
                 <w:rFonts w:ascii="Arial" w:eastAsia="Times New Roman" w:hAnsi="Arial" w:cs="Arial"/>
@@ -2303,6 +2428,7 @@
               </w:rPr>
               <w:t>string</w:t>
             </w:r>
+            <w:proofErr w:type="spellEnd"/>
           </w:p>
         </w:tc>
         <w:tc>
@@ -2372,6 +2498,7 @@
                 <w14:ligatures w14:val="none"/>
               </w:rPr>
             </w:pPr>
+            <w:proofErr w:type="spellStart"/>
             <w:r>
               <w:rPr>
                 <w:rFonts w:ascii="Arial" w:eastAsia="Times New Roman" w:hAnsi="Arial" w:cs="Arial"/>
@@ -2382,6 +2509,7 @@
               </w:rPr>
               <w:t>descripcion</w:t>
             </w:r>
+            <w:proofErr w:type="spellEnd"/>
           </w:p>
         </w:tc>
         <w:tc>
@@ -2409,6 +2537,7 @@
                 <w14:ligatures w14:val="none"/>
               </w:rPr>
             </w:pPr>
+            <w:proofErr w:type="spellStart"/>
             <w:r>
               <w:rPr>
                 <w:rFonts w:ascii="Arial" w:eastAsia="Times New Roman" w:hAnsi="Arial" w:cs="Arial"/>
@@ -2419,6 +2548,7 @@
               </w:rPr>
               <w:t>string</w:t>
             </w:r>
+            <w:proofErr w:type="spellEnd"/>
           </w:p>
         </w:tc>
         <w:tc>
@@ -2488,6 +2618,7 @@
                 <w14:ligatures w14:val="none"/>
               </w:rPr>
             </w:pPr>
+            <w:proofErr w:type="spellStart"/>
             <w:r>
               <w:rPr>
                 <w:rFonts w:ascii="Arial" w:eastAsia="Times New Roman" w:hAnsi="Arial" w:cs="Arial"/>
@@ -2498,6 +2629,7 @@
               </w:rPr>
               <w:t>categoriaId</w:t>
             </w:r>
+            <w:proofErr w:type="spellEnd"/>
           </w:p>
         </w:tc>
         <w:tc>
@@ -2525,6 +2657,7 @@
                 <w14:ligatures w14:val="none"/>
               </w:rPr>
             </w:pPr>
+            <w:proofErr w:type="spellStart"/>
             <w:r>
               <w:rPr>
                 <w:rFonts w:ascii="Arial" w:eastAsia="Times New Roman" w:hAnsi="Arial" w:cs="Arial"/>
@@ -2535,6 +2668,7 @@
               </w:rPr>
               <w:t>guid</w:t>
             </w:r>
+            <w:proofErr w:type="spellEnd"/>
           </w:p>
         </w:tc>
         <w:tc>
@@ -2602,6 +2736,7 @@
                 <w14:ligatures w14:val="none"/>
               </w:rPr>
             </w:pPr>
+            <w:proofErr w:type="spellStart"/>
             <w:r>
               <w:rPr>
                 <w:rFonts w:ascii="Arial" w:eastAsia="Times New Roman" w:hAnsi="Arial" w:cs="Arial"/>
@@ -2612,6 +2747,7 @@
               </w:rPr>
               <w:t>priodidad</w:t>
             </w:r>
+            <w:proofErr w:type="spellEnd"/>
           </w:p>
         </w:tc>
         <w:tc>
@@ -2758,7 +2894,51 @@
                 <w:lang w:eastAsia="es-GT"/>
                 <w14:ligatures w14:val="none"/>
               </w:rPr>
-              <w:t>nueva - asignada - enProceso -  resuelta - cerrada - cancelada</w:t>
+              <w:t xml:space="preserve">nueva - asignada - </w:t>
+            </w:r>
+            <w:proofErr w:type="spellStart"/>
+            <w:r>
+              <w:rPr>
+                <w:rFonts w:ascii="Arial" w:eastAsia="Times New Roman" w:hAnsi="Arial" w:cs="Arial"/>
+                <w:color w:val="000000"/>
+                <w:kern w:val="0"/>
+                <w:lang w:eastAsia="es-GT"/>
+                <w14:ligatures w14:val="none"/>
+              </w:rPr>
+              <w:t>enProceso</w:t>
+            </w:r>
+            <w:proofErr w:type="spellEnd"/>
+            <w:r>
+              <w:rPr>
+                <w:rFonts w:ascii="Arial" w:eastAsia="Times New Roman" w:hAnsi="Arial" w:cs="Arial"/>
+                <w:color w:val="000000"/>
+                <w:kern w:val="0"/>
+                <w:lang w:eastAsia="es-GT"/>
+                <w14:ligatures w14:val="none"/>
+              </w:rPr>
+              <w:t xml:space="preserve"> </w:t>
+            </w:r>
+            <w:proofErr w:type="gramStart"/>
+            <w:r>
+              <w:rPr>
+                <w:rFonts w:ascii="Arial" w:eastAsia="Times New Roman" w:hAnsi="Arial" w:cs="Arial"/>
+                <w:color w:val="000000"/>
+                <w:kern w:val="0"/>
+                <w:lang w:eastAsia="es-GT"/>
+                <w14:ligatures w14:val="none"/>
+              </w:rPr>
+              <w:t>-  resuelta</w:t>
+            </w:r>
+            <w:proofErr w:type="gramEnd"/>
+            <w:r>
+              <w:rPr>
+                <w:rFonts w:ascii="Arial" w:eastAsia="Times New Roman" w:hAnsi="Arial" w:cs="Arial"/>
+                <w:color w:val="000000"/>
+                <w:kern w:val="0"/>
+                <w:lang w:eastAsia="es-GT"/>
+                <w14:ligatures w14:val="none"/>
+              </w:rPr>
+              <w:t xml:space="preserve"> - cerrada - cancelada</w:t>
             </w:r>
           </w:p>
         </w:tc>
@@ -2827,6 +3007,7 @@
                 <w14:ligatures w14:val="none"/>
               </w:rPr>
             </w:pPr>
+            <w:proofErr w:type="spellStart"/>
             <w:r>
               <w:rPr>
                 <w:rFonts w:ascii="Arial" w:eastAsia="Times New Roman" w:hAnsi="Arial" w:cs="Arial"/>
@@ -2837,6 +3018,7 @@
               </w:rPr>
               <w:t>solicitanteId</w:t>
             </w:r>
+            <w:proofErr w:type="spellEnd"/>
           </w:p>
         </w:tc>
         <w:tc>
@@ -2864,6 +3046,7 @@
                 <w14:ligatures w14:val="none"/>
               </w:rPr>
             </w:pPr>
+            <w:proofErr w:type="spellStart"/>
             <w:r>
               <w:rPr>
                 <w:rFonts w:ascii="Arial" w:eastAsia="Times New Roman" w:hAnsi="Arial" w:cs="Arial"/>
@@ -2874,6 +3057,7 @@
               </w:rPr>
               <w:t>guid</w:t>
             </w:r>
+            <w:proofErr w:type="spellEnd"/>
           </w:p>
         </w:tc>
         <w:tc>
@@ -2942,6 +3126,7 @@
                 <w14:ligatures w14:val="none"/>
               </w:rPr>
             </w:pPr>
+            <w:proofErr w:type="spellStart"/>
             <w:r>
               <w:rPr>
                 <w:rFonts w:ascii="Arial" w:eastAsia="Times New Roman" w:hAnsi="Arial" w:cs="Arial"/>
@@ -2952,6 +3137,7 @@
               </w:rPr>
               <w:t>agenteId</w:t>
             </w:r>
+            <w:proofErr w:type="spellEnd"/>
           </w:p>
         </w:tc>
         <w:tc>
@@ -2979,16 +3165,40 @@
                 <w14:ligatures w14:val="none"/>
               </w:rPr>
             </w:pPr>
-            <w:r>
-              <w:rPr>
-                <w:rFonts w:ascii="Arial" w:eastAsia="Times New Roman" w:hAnsi="Arial" w:cs="Arial"/>
-                <w:color w:val="000000"/>
-                <w:kern w:val="0"/>
-                <w:lang w:eastAsia="es-GT"/>
-                <w14:ligatures w14:val="none"/>
-              </w:rPr>
-              <w:t>guid, nullable</w:t>
-            </w:r>
+            <w:proofErr w:type="spellStart"/>
+            <w:r>
+              <w:rPr>
+                <w:rFonts w:ascii="Arial" w:eastAsia="Times New Roman" w:hAnsi="Arial" w:cs="Arial"/>
+                <w:color w:val="000000"/>
+                <w:kern w:val="0"/>
+                <w:lang w:eastAsia="es-GT"/>
+                <w14:ligatures w14:val="none"/>
+              </w:rPr>
+              <w:t>guid</w:t>
+            </w:r>
+            <w:proofErr w:type="spellEnd"/>
+            <w:r>
+              <w:rPr>
+                <w:rFonts w:ascii="Arial" w:eastAsia="Times New Roman" w:hAnsi="Arial" w:cs="Arial"/>
+                <w:color w:val="000000"/>
+                <w:kern w:val="0"/>
+                <w:lang w:eastAsia="es-GT"/>
+                <w14:ligatures w14:val="none"/>
+              </w:rPr>
+              <w:t xml:space="preserve">, </w:t>
+            </w:r>
+            <w:proofErr w:type="spellStart"/>
+            <w:r>
+              <w:rPr>
+                <w:rFonts w:ascii="Arial" w:eastAsia="Times New Roman" w:hAnsi="Arial" w:cs="Arial"/>
+                <w:color w:val="000000"/>
+                <w:kern w:val="0"/>
+                <w:lang w:eastAsia="es-GT"/>
+                <w14:ligatures w14:val="none"/>
+              </w:rPr>
+              <w:t>nullable</w:t>
+            </w:r>
+            <w:proofErr w:type="spellEnd"/>
           </w:p>
         </w:tc>
         <w:tc>
@@ -3057,6 +3267,7 @@
                 <w14:ligatures w14:val="none"/>
               </w:rPr>
             </w:pPr>
+            <w:proofErr w:type="spellStart"/>
             <w:r>
               <w:rPr>
                 <w:rFonts w:ascii="Arial" w:eastAsia="Times New Roman" w:hAnsi="Arial" w:cs="Arial"/>
@@ -3067,6 +3278,7 @@
               </w:rPr>
               <w:t>fechaCreacion</w:t>
             </w:r>
+            <w:proofErr w:type="spellEnd"/>
           </w:p>
         </w:tc>
         <w:tc>
@@ -3094,15 +3306,27 @@
                 <w14:ligatures w14:val="none"/>
               </w:rPr>
             </w:pPr>
-            <w:r>
-              <w:rPr>
-                <w:rFonts w:ascii="Arial" w:eastAsia="Times New Roman" w:hAnsi="Arial" w:cs="Arial"/>
-                <w:color w:val="000000"/>
-                <w:kern w:val="0"/>
-                <w:lang w:eastAsia="es-GT"/>
-                <w14:ligatures w14:val="none"/>
-              </w:rPr>
-              <w:t>datatime UTC</w:t>
+            <w:proofErr w:type="spellStart"/>
+            <w:r>
+              <w:rPr>
+                <w:rFonts w:ascii="Arial" w:eastAsia="Times New Roman" w:hAnsi="Arial" w:cs="Arial"/>
+                <w:color w:val="000000"/>
+                <w:kern w:val="0"/>
+                <w:lang w:eastAsia="es-GT"/>
+                <w14:ligatures w14:val="none"/>
+              </w:rPr>
+              <w:t>datatime</w:t>
+            </w:r>
+            <w:proofErr w:type="spellEnd"/>
+            <w:r>
+              <w:rPr>
+                <w:rFonts w:ascii="Arial" w:eastAsia="Times New Roman" w:hAnsi="Arial" w:cs="Arial"/>
+                <w:color w:val="000000"/>
+                <w:kern w:val="0"/>
+                <w:lang w:eastAsia="es-GT"/>
+                <w14:ligatures w14:val="none"/>
+              </w:rPr>
+              <w:t xml:space="preserve"> UTC</w:t>
             </w:r>
           </w:p>
         </w:tc>
@@ -3172,6 +3396,7 @@
                 <w14:ligatures w14:val="none"/>
               </w:rPr>
             </w:pPr>
+            <w:proofErr w:type="spellStart"/>
             <w:r>
               <w:rPr>
                 <w:rFonts w:ascii="Arial" w:eastAsia="Times New Roman" w:hAnsi="Arial" w:cs="Arial"/>
@@ -3182,6 +3407,7 @@
               </w:rPr>
               <w:t>fechaLimiteSla</w:t>
             </w:r>
+            <w:proofErr w:type="spellEnd"/>
           </w:p>
         </w:tc>
         <w:tc>
@@ -3209,15 +3435,27 @@
                 <w14:ligatures w14:val="none"/>
               </w:rPr>
             </w:pPr>
-            <w:r>
-              <w:rPr>
-                <w:rFonts w:ascii="Arial" w:eastAsia="Times New Roman" w:hAnsi="Arial" w:cs="Arial"/>
-                <w:color w:val="000000"/>
-                <w:kern w:val="0"/>
-                <w:lang w:eastAsia="es-GT"/>
-                <w14:ligatures w14:val="none"/>
-              </w:rPr>
-              <w:t>datatime UTC</w:t>
+            <w:proofErr w:type="spellStart"/>
+            <w:r>
+              <w:rPr>
+                <w:rFonts w:ascii="Arial" w:eastAsia="Times New Roman" w:hAnsi="Arial" w:cs="Arial"/>
+                <w:color w:val="000000"/>
+                <w:kern w:val="0"/>
+                <w:lang w:eastAsia="es-GT"/>
+                <w14:ligatures w14:val="none"/>
+              </w:rPr>
+              <w:t>datatime</w:t>
+            </w:r>
+            <w:proofErr w:type="spellEnd"/>
+            <w:r>
+              <w:rPr>
+                <w:rFonts w:ascii="Arial" w:eastAsia="Times New Roman" w:hAnsi="Arial" w:cs="Arial"/>
+                <w:color w:val="000000"/>
+                <w:kern w:val="0"/>
+                <w:lang w:eastAsia="es-GT"/>
+                <w14:ligatures w14:val="none"/>
+              </w:rPr>
+              <w:t xml:space="preserve"> UTC</w:t>
             </w:r>
           </w:p>
         </w:tc>
@@ -3287,6 +3525,7 @@
                 <w14:ligatures w14:val="none"/>
               </w:rPr>
             </w:pPr>
+            <w:proofErr w:type="spellStart"/>
             <w:r>
               <w:rPr>
                 <w:rFonts w:ascii="Arial" w:eastAsia="Times New Roman" w:hAnsi="Arial" w:cs="Arial"/>
@@ -3297,6 +3536,7 @@
               </w:rPr>
               <w:t>fechaResolicion</w:t>
             </w:r>
+            <w:proofErr w:type="spellEnd"/>
           </w:p>
         </w:tc>
         <w:tc>
@@ -3324,16 +3564,42 @@
                 <w14:ligatures w14:val="none"/>
               </w:rPr>
             </w:pPr>
-            <w:r>
-              <w:rPr>
-                <w:rFonts w:ascii="Arial" w:eastAsia="Times New Roman" w:hAnsi="Arial" w:cs="Arial"/>
-                <w:color w:val="000000"/>
-                <w:kern w:val="0"/>
-                <w:lang w:eastAsia="es-GT"/>
-                <w14:ligatures w14:val="none"/>
-              </w:rPr>
-              <w:t>datatime UTC,nullable</w:t>
-            </w:r>
+            <w:proofErr w:type="spellStart"/>
+            <w:r>
+              <w:rPr>
+                <w:rFonts w:ascii="Arial" w:eastAsia="Times New Roman" w:hAnsi="Arial" w:cs="Arial"/>
+                <w:color w:val="000000"/>
+                <w:kern w:val="0"/>
+                <w:lang w:eastAsia="es-GT"/>
+                <w14:ligatures w14:val="none"/>
+              </w:rPr>
+              <w:t>datatime</w:t>
+            </w:r>
+            <w:proofErr w:type="spellEnd"/>
+            <w:r>
+              <w:rPr>
+                <w:rFonts w:ascii="Arial" w:eastAsia="Times New Roman" w:hAnsi="Arial" w:cs="Arial"/>
+                <w:color w:val="000000"/>
+                <w:kern w:val="0"/>
+                <w:lang w:eastAsia="es-GT"/>
+                <w14:ligatures w14:val="none"/>
+              </w:rPr>
+              <w:t xml:space="preserve"> </w:t>
+            </w:r>
+            <w:proofErr w:type="spellStart"/>
+            <w:proofErr w:type="gramStart"/>
+            <w:r>
+              <w:rPr>
+                <w:rFonts w:ascii="Arial" w:eastAsia="Times New Roman" w:hAnsi="Arial" w:cs="Arial"/>
+                <w:color w:val="000000"/>
+                <w:kern w:val="0"/>
+                <w:lang w:eastAsia="es-GT"/>
+                <w14:ligatures w14:val="none"/>
+              </w:rPr>
+              <w:t>UTC,nullable</w:t>
+            </w:r>
+            <w:proofErr w:type="spellEnd"/>
+            <w:proofErr w:type="gramEnd"/>
           </w:p>
         </w:tc>
         <w:tc>
@@ -3402,6 +3668,7 @@
                 <w14:ligatures w14:val="none"/>
               </w:rPr>
             </w:pPr>
+            <w:proofErr w:type="spellStart"/>
             <w:r>
               <w:rPr>
                 <w:rFonts w:ascii="Arial" w:eastAsia="Times New Roman" w:hAnsi="Arial" w:cs="Arial"/>
@@ -3412,6 +3679,7 @@
               </w:rPr>
               <w:t>motivoResolucion</w:t>
             </w:r>
+            <w:proofErr w:type="spellEnd"/>
           </w:p>
         </w:tc>
         <w:tc>
@@ -3439,16 +3707,40 @@
                 <w14:ligatures w14:val="none"/>
               </w:rPr>
             </w:pPr>
-            <w:r>
-              <w:rPr>
-                <w:rFonts w:ascii="Arial" w:eastAsia="Times New Roman" w:hAnsi="Arial" w:cs="Arial"/>
-                <w:color w:val="000000"/>
-                <w:kern w:val="0"/>
-                <w:lang w:eastAsia="es-GT"/>
-                <w14:ligatures w14:val="none"/>
-              </w:rPr>
-              <w:t>string, nullable</w:t>
-            </w:r>
+            <w:proofErr w:type="spellStart"/>
+            <w:r>
+              <w:rPr>
+                <w:rFonts w:ascii="Arial" w:eastAsia="Times New Roman" w:hAnsi="Arial" w:cs="Arial"/>
+                <w:color w:val="000000"/>
+                <w:kern w:val="0"/>
+                <w:lang w:eastAsia="es-GT"/>
+                <w14:ligatures w14:val="none"/>
+              </w:rPr>
+              <w:t>string</w:t>
+            </w:r>
+            <w:proofErr w:type="spellEnd"/>
+            <w:r>
+              <w:rPr>
+                <w:rFonts w:ascii="Arial" w:eastAsia="Times New Roman" w:hAnsi="Arial" w:cs="Arial"/>
+                <w:color w:val="000000"/>
+                <w:kern w:val="0"/>
+                <w:lang w:eastAsia="es-GT"/>
+                <w14:ligatures w14:val="none"/>
+              </w:rPr>
+              <w:t xml:space="preserve">, </w:t>
+            </w:r>
+            <w:proofErr w:type="spellStart"/>
+            <w:r>
+              <w:rPr>
+                <w:rFonts w:ascii="Arial" w:eastAsia="Times New Roman" w:hAnsi="Arial" w:cs="Arial"/>
+                <w:color w:val="000000"/>
+                <w:kern w:val="0"/>
+                <w:lang w:eastAsia="es-GT"/>
+                <w14:ligatures w14:val="none"/>
+              </w:rPr>
+              <w:t>nullable</w:t>
+            </w:r>
+            <w:proofErr w:type="spellEnd"/>
           </w:p>
         </w:tc>
         <w:tc>
@@ -3517,6 +3809,7 @@
                 <w14:ligatures w14:val="none"/>
               </w:rPr>
             </w:pPr>
+            <w:proofErr w:type="spellStart"/>
             <w:r>
               <w:rPr>
                 <w:rFonts w:ascii="Arial" w:eastAsia="Times New Roman" w:hAnsi="Arial" w:cs="Arial"/>
@@ -3527,6 +3820,7 @@
               </w:rPr>
               <w:t>motivoCancelación</w:t>
             </w:r>
+            <w:proofErr w:type="spellEnd"/>
           </w:p>
         </w:tc>
         <w:tc>
@@ -3554,16 +3848,40 @@
                 <w14:ligatures w14:val="none"/>
               </w:rPr>
             </w:pPr>
-            <w:r>
-              <w:rPr>
-                <w:rFonts w:ascii="Arial" w:eastAsia="Times New Roman" w:hAnsi="Arial" w:cs="Arial"/>
-                <w:color w:val="000000"/>
-                <w:kern w:val="0"/>
-                <w:lang w:eastAsia="es-GT"/>
-                <w14:ligatures w14:val="none"/>
-              </w:rPr>
-              <w:t>string, nullable</w:t>
-            </w:r>
+            <w:proofErr w:type="spellStart"/>
+            <w:r>
+              <w:rPr>
+                <w:rFonts w:ascii="Arial" w:eastAsia="Times New Roman" w:hAnsi="Arial" w:cs="Arial"/>
+                <w:color w:val="000000"/>
+                <w:kern w:val="0"/>
+                <w:lang w:eastAsia="es-GT"/>
+                <w14:ligatures w14:val="none"/>
+              </w:rPr>
+              <w:t>string</w:t>
+            </w:r>
+            <w:proofErr w:type="spellEnd"/>
+            <w:r>
+              <w:rPr>
+                <w:rFonts w:ascii="Arial" w:eastAsia="Times New Roman" w:hAnsi="Arial" w:cs="Arial"/>
+                <w:color w:val="000000"/>
+                <w:kern w:val="0"/>
+                <w:lang w:eastAsia="es-GT"/>
+                <w14:ligatures w14:val="none"/>
+              </w:rPr>
+              <w:t xml:space="preserve">, </w:t>
+            </w:r>
+            <w:proofErr w:type="spellStart"/>
+            <w:r>
+              <w:rPr>
+                <w:rFonts w:ascii="Arial" w:eastAsia="Times New Roman" w:hAnsi="Arial" w:cs="Arial"/>
+                <w:color w:val="000000"/>
+                <w:kern w:val="0"/>
+                <w:lang w:eastAsia="es-GT"/>
+                <w14:ligatures w14:val="none"/>
+              </w:rPr>
+              <w:t>nullable</w:t>
+            </w:r>
+            <w:proofErr w:type="spellEnd"/>
           </w:p>
         </w:tc>
         <w:tc>
@@ -3659,8 +3977,44 @@
         <w:rPr>
           <w:rFonts w:ascii="Arial" w:hAnsi="Arial" w:cs="Arial"/>
         </w:rPr>
-        <w:t>Validamos en cmd dotnet –version</w:t>
-      </w:r>
+        <w:t xml:space="preserve">Validamos en </w:t>
+      </w:r>
+      <w:proofErr w:type="spellStart"/>
+      <w:r>
+        <w:rPr>
+          <w:rFonts w:ascii="Arial" w:hAnsi="Arial" w:cs="Arial"/>
+        </w:rPr>
+        <w:t>cmd</w:t>
+      </w:r>
+      <w:proofErr w:type="spellEnd"/>
+      <w:r>
+        <w:rPr>
+          <w:rFonts w:ascii="Arial" w:hAnsi="Arial" w:cs="Arial"/>
+        </w:rPr>
+        <w:t xml:space="preserve"> </w:t>
+      </w:r>
+      <w:proofErr w:type="spellStart"/>
+      <w:r>
+        <w:rPr>
+          <w:rFonts w:ascii="Arial" w:hAnsi="Arial" w:cs="Arial"/>
+        </w:rPr>
+        <w:t>dotnet</w:t>
+      </w:r>
+      <w:proofErr w:type="spellEnd"/>
+      <w:r>
+        <w:rPr>
+          <w:rFonts w:ascii="Arial" w:hAnsi="Arial" w:cs="Arial"/>
+        </w:rPr>
+        <w:t xml:space="preserve"> –</w:t>
+      </w:r>
+      <w:proofErr w:type="spellStart"/>
+      <w:r>
+        <w:rPr>
+          <w:rFonts w:ascii="Arial" w:hAnsi="Arial" w:cs="Arial"/>
+        </w:rPr>
+        <w:t>version</w:t>
+      </w:r>
+      <w:proofErr w:type="spellEnd"/>
     </w:p>
     <w:p>
       <w:pPr>
@@ -3697,8 +4051,17 @@
           <w:rFonts w:ascii="Arial" w:hAnsi="Arial" w:cs="Arial"/>
           <w:bCs/>
         </w:rPr>
-        <w:t>en visual estudio code</w:t>
-      </w:r>
+        <w:t xml:space="preserve">en visual estudio </w:t>
+      </w:r>
+      <w:proofErr w:type="spellStart"/>
+      <w:r>
+        <w:rPr>
+          <w:rFonts w:ascii="Arial" w:hAnsi="Arial" w:cs="Arial"/>
+          <w:bCs/>
+        </w:rPr>
+        <w:t>code</w:t>
+      </w:r>
+      <w:proofErr w:type="spellEnd"/>
     </w:p>
     <w:p>
       <w:pPr>
@@ -3730,26 +4093,92 @@
           <w:bCs/>
         </w:rPr>
       </w:pPr>
-      <w:r>
-        <w:rPr>
-          <w:rFonts w:ascii="Arial" w:hAnsi="Arial" w:cs="Arial"/>
-          <w:bCs/>
-        </w:rPr>
-        <w:t>dotnet new webapi -n Api -o backend</w:t>
-      </w:r>
-      <w:r>
-        <w:rPr>
-          <w:rFonts w:ascii="Arial" w:hAnsi="Arial" w:cs="Arial"/>
-          <w:bCs/>
-        </w:rPr>
-        <w:t xml:space="preserve"> –dotnet new (creamos Nuestro Proyecto nuevo con</w:t>
-      </w:r>
-      <w:r>
-        <w:rPr>
-          <w:rFonts w:ascii="Arial" w:hAnsi="Arial" w:cs="Arial"/>
-          <w:bCs/>
-        </w:rPr>
-        <w:t xml:space="preserve"> la plantilla web api –n le damos el nombre a la solución del proyecto -o backendo donde se generan nuestros archivos y </w:t>
+      <w:proofErr w:type="spellStart"/>
+      <w:r>
+        <w:rPr>
+          <w:rFonts w:ascii="Arial" w:hAnsi="Arial" w:cs="Arial"/>
+          <w:bCs/>
+        </w:rPr>
+        <w:t>dotnet</w:t>
+      </w:r>
+      <w:proofErr w:type="spellEnd"/>
+      <w:r>
+        <w:rPr>
+          <w:rFonts w:ascii="Arial" w:hAnsi="Arial" w:cs="Arial"/>
+          <w:bCs/>
+        </w:rPr>
+        <w:t xml:space="preserve"> new </w:t>
+      </w:r>
+      <w:proofErr w:type="spellStart"/>
+      <w:r>
+        <w:rPr>
+          <w:rFonts w:ascii="Arial" w:hAnsi="Arial" w:cs="Arial"/>
+          <w:bCs/>
+        </w:rPr>
+        <w:t>webapi</w:t>
+      </w:r>
+      <w:proofErr w:type="spellEnd"/>
+      <w:r>
+        <w:rPr>
+          <w:rFonts w:ascii="Arial" w:hAnsi="Arial" w:cs="Arial"/>
+          <w:bCs/>
+        </w:rPr>
+        <w:t xml:space="preserve"> -n Api -o </w:t>
+      </w:r>
+      <w:proofErr w:type="spellStart"/>
+      <w:r>
+        <w:rPr>
+          <w:rFonts w:ascii="Arial" w:hAnsi="Arial" w:cs="Arial"/>
+          <w:bCs/>
+        </w:rPr>
+        <w:t>backend</w:t>
+      </w:r>
+      <w:proofErr w:type="spellEnd"/>
+      <w:r>
+        <w:rPr>
+          <w:rFonts w:ascii="Arial" w:hAnsi="Arial" w:cs="Arial"/>
+          <w:bCs/>
+        </w:rPr>
+        <w:t xml:space="preserve"> –</w:t>
+      </w:r>
+      <w:proofErr w:type="spellStart"/>
+      <w:r>
+        <w:rPr>
+          <w:rFonts w:ascii="Arial" w:hAnsi="Arial" w:cs="Arial"/>
+          <w:bCs/>
+        </w:rPr>
+        <w:t>dotnet</w:t>
+      </w:r>
+      <w:proofErr w:type="spellEnd"/>
+      <w:r>
+        <w:rPr>
+          <w:rFonts w:ascii="Arial" w:hAnsi="Arial" w:cs="Arial"/>
+          <w:bCs/>
+        </w:rPr>
+        <w:t xml:space="preserve"> new (creamos Nuestro Proyecto nuevo con</w:t>
+      </w:r>
+      <w:r>
+        <w:rPr>
+          <w:rFonts w:ascii="Arial" w:hAnsi="Arial" w:cs="Arial"/>
+          <w:bCs/>
+        </w:rPr>
+        <w:t xml:space="preserve"> la plantilla web api –n le damos el nombre a la solución del proyecto -o </w:t>
+      </w:r>
+      <w:proofErr w:type="spellStart"/>
+      <w:r>
+        <w:rPr>
+          <w:rFonts w:ascii="Arial" w:hAnsi="Arial" w:cs="Arial"/>
+          <w:bCs/>
+        </w:rPr>
+        <w:t>backendo</w:t>
+      </w:r>
+      <w:proofErr w:type="spellEnd"/>
+      <w:r>
+        <w:rPr>
+          <w:rFonts w:ascii="Arial" w:hAnsi="Arial" w:cs="Arial"/>
+          <w:bCs/>
+        </w:rPr>
+        <w:t xml:space="preserve"> donde se generan nuestros archivos y </w:t>
       </w:r>
       <w:r>
         <w:rPr>
@@ -3779,14 +4208,40 @@
           <w:b/>
           <w:bCs/>
         </w:rPr>
-        <w:t>API Web RESTful</w:t>
-      </w:r>
-      <w:r>
-        <w:rPr>
-          <w:rFonts w:ascii="Arial" w:hAnsi="Arial" w:cs="Arial"/>
-          <w:bCs/>
-        </w:rPr>
-        <w:t xml:space="preserve"> (con los controladores, configuración del servidor HTTP y Swagger/OpenAPI ya listos para usar).</w:t>
+        <w:t xml:space="preserve">API Web </w:t>
+      </w:r>
+      <w:proofErr w:type="spellStart"/>
+      <w:r>
+        <w:rPr>
+          <w:rFonts w:ascii="Arial" w:hAnsi="Arial" w:cs="Arial"/>
+          <w:b/>
+          <w:bCs/>
+        </w:rPr>
+        <w:t>RESTful</w:t>
+      </w:r>
+      <w:proofErr w:type="spellEnd"/>
+      <w:r>
+        <w:rPr>
+          <w:rFonts w:ascii="Arial" w:hAnsi="Arial" w:cs="Arial"/>
+          <w:bCs/>
+        </w:rPr>
+        <w:t xml:space="preserve"> (con los controladores, configuración del servidor HTTP y Swagger/</w:t>
+      </w:r>
+      <w:proofErr w:type="spellStart"/>
+      <w:r>
+        <w:rPr>
+          <w:rFonts w:ascii="Arial" w:hAnsi="Arial" w:cs="Arial"/>
+          <w:bCs/>
+        </w:rPr>
+        <w:t>OpenAPI</w:t>
+      </w:r>
+      <w:proofErr w:type="spellEnd"/>
+      <w:r>
+        <w:rPr>
+          <w:rFonts w:ascii="Arial" w:hAnsi="Arial" w:cs="Arial"/>
+          <w:bCs/>
+        </w:rPr>
+        <w:t xml:space="preserve"> ya listos para usar).</w:t>
       </w:r>
     </w:p>
     <w:p>
@@ -3855,6 +4310,7 @@
                 <w14:ligatures w14:val="none"/>
               </w:rPr>
             </w:pPr>
+            <w:proofErr w:type="spellStart"/>
             <w:r>
               <w:rPr>
                 <w:rFonts w:ascii="Aptos Narrow" w:eastAsia="Times New Roman" w:hAnsi="Aptos Narrow" w:cs="Times New Roman"/>
@@ -3865,7 +4321,20 @@
                 <w:lang w:eastAsia="es-GT"/>
                 <w14:ligatures w14:val="none"/>
               </w:rPr>
-              <w:t>backend/</w:t>
+              <w:t>backend</w:t>
+            </w:r>
+            <w:proofErr w:type="spellEnd"/>
+            <w:r>
+              <w:rPr>
+                <w:rFonts w:ascii="Aptos Narrow" w:eastAsia="Times New Roman" w:hAnsi="Aptos Narrow" w:cs="Times New Roman"/>
+                <w:color w:val="000000"/>
+                <w:kern w:val="0"/>
+                <w:sz w:val="22"/>
+                <w:szCs w:val="22"/>
+                <w:lang w:eastAsia="es-GT"/>
+                <w14:ligatures w14:val="none"/>
+              </w:rPr>
+              <w:t>/</w:t>
             </w:r>
           </w:p>
         </w:tc>
@@ -3940,6 +4409,7 @@
                 <w14:ligatures w14:val="none"/>
               </w:rPr>
             </w:pPr>
+            <w:proofErr w:type="spellStart"/>
             <w:r>
               <w:rPr>
                 <w:rFonts w:ascii="Aptos Narrow" w:eastAsia="Times New Roman" w:hAnsi="Aptos Narrow" w:cs="Times New Roman"/>
@@ -3950,26 +4420,10 @@
                 <w:lang w:eastAsia="es-GT"/>
                 <w14:ligatures w14:val="none"/>
               </w:rPr>
-              <w:t>Controllers/</w:t>
-            </w:r>
-          </w:p>
-        </w:tc>
-        <w:tc>
-          <w:tcPr>
-            <w:tcW w:w="5060" w:type="dxa"/>
-            <w:tcBorders>
-              <w:top w:val="nil"/>
-              <w:left w:val="nil"/>
-              <w:bottom w:val="single" w:sz="4" w:space="0" w:color="auto"/>
-              <w:right w:val="single" w:sz="4" w:space="0" w:color="auto"/>
-            </w:tcBorders>
-            <w:noWrap/>
-            <w:vAlign w:val="bottom"/>
-            <w:hideMark/>
-          </w:tcPr>
-          <w:p>
-            <w:pPr>
-              <w:spacing w:after="0" w:line="240" w:lineRule="auto"/>
+              <w:t>Controllers</w:t>
+            </w:r>
+            <w:proofErr w:type="spellEnd"/>
+            <w:r>
               <w:rPr>
                 <w:rFonts w:ascii="Aptos Narrow" w:eastAsia="Times New Roman" w:hAnsi="Aptos Narrow" w:cs="Times New Roman"/>
                 <w:color w:val="000000"/>
@@ -3979,8 +4433,26 @@
                 <w:lang w:eastAsia="es-GT"/>
                 <w14:ligatures w14:val="none"/>
               </w:rPr>
-            </w:pPr>
-            <w:r>
+              <w:t>/</w:t>
+            </w:r>
+          </w:p>
+        </w:tc>
+        <w:tc>
+          <w:tcPr>
+            <w:tcW w:w="5060" w:type="dxa"/>
+            <w:tcBorders>
+              <w:top w:val="nil"/>
+              <w:left w:val="nil"/>
+              <w:bottom w:val="single" w:sz="4" w:space="0" w:color="auto"/>
+              <w:right w:val="single" w:sz="4" w:space="0" w:color="auto"/>
+            </w:tcBorders>
+            <w:noWrap/>
+            <w:vAlign w:val="bottom"/>
+            <w:hideMark/>
+          </w:tcPr>
+          <w:p>
+            <w:pPr>
+              <w:spacing w:after="0" w:line="240" w:lineRule="auto"/>
               <w:rPr>
                 <w:rFonts w:ascii="Aptos Narrow" w:eastAsia="Times New Roman" w:hAnsi="Aptos Narrow" w:cs="Times New Roman"/>
                 <w:color w:val="000000"/>
@@ -3990,7 +4462,44 @@
                 <w:lang w:eastAsia="es-GT"/>
                 <w14:ligatures w14:val="none"/>
               </w:rPr>
-              <w:t>Aquí irán tus clases con los Endpoints (POST, GET, etc.)</w:t>
+            </w:pPr>
+            <w:r>
+              <w:rPr>
+                <w:rFonts w:ascii="Aptos Narrow" w:eastAsia="Times New Roman" w:hAnsi="Aptos Narrow" w:cs="Times New Roman"/>
+                <w:color w:val="000000"/>
+                <w:kern w:val="0"/>
+                <w:sz w:val="22"/>
+                <w:szCs w:val="22"/>
+                <w:lang w:eastAsia="es-GT"/>
+                <w14:ligatures w14:val="none"/>
+              </w:rPr>
+              <w:t xml:space="preserve">Aquí irán tus clases con los </w:t>
+            </w:r>
+            <w:proofErr w:type="spellStart"/>
+            <w:r>
+              <w:rPr>
+                <w:rFonts w:ascii="Aptos Narrow" w:eastAsia="Times New Roman" w:hAnsi="Aptos Narrow" w:cs="Times New Roman"/>
+                <w:color w:val="000000"/>
+                <w:kern w:val="0"/>
+                <w:sz w:val="22"/>
+                <w:szCs w:val="22"/>
+                <w:lang w:eastAsia="es-GT"/>
+                <w14:ligatures w14:val="none"/>
+              </w:rPr>
+              <w:t>Endpoints</w:t>
+            </w:r>
+            <w:proofErr w:type="spellEnd"/>
+            <w:r>
+              <w:rPr>
+                <w:rFonts w:ascii="Aptos Narrow" w:eastAsia="Times New Roman" w:hAnsi="Aptos Narrow" w:cs="Times New Roman"/>
+                <w:color w:val="000000"/>
+                <w:kern w:val="0"/>
+                <w:sz w:val="22"/>
+                <w:szCs w:val="22"/>
+                <w:lang w:eastAsia="es-GT"/>
+                <w14:ligatures w14:val="none"/>
+              </w:rPr>
+              <w:t xml:space="preserve"> (POST, GET, etc.)</w:t>
             </w:r>
           </w:p>
         </w:tc>
@@ -4025,6 +4534,7 @@
                 <w14:ligatures w14:val="none"/>
               </w:rPr>
             </w:pPr>
+            <w:proofErr w:type="spellStart"/>
             <w:r>
               <w:rPr>
                 <w:rFonts w:ascii="Aptos Narrow" w:eastAsia="Times New Roman" w:hAnsi="Aptos Narrow" w:cs="Times New Roman"/>
@@ -4037,6 +4547,7 @@
               </w:rPr>
               <w:t>Program.cs</w:t>
             </w:r>
+            <w:proofErr w:type="spellEnd"/>
           </w:p>
         </w:tc>
         <w:tc>
@@ -4110,6 +4621,7 @@
                 <w14:ligatures w14:val="none"/>
               </w:rPr>
             </w:pPr>
+            <w:proofErr w:type="spellStart"/>
             <w:r>
               <w:rPr>
                 <w:rFonts w:ascii="Aptos Narrow" w:eastAsia="Times New Roman" w:hAnsi="Aptos Narrow" w:cs="Times New Roman"/>
@@ -4122,6 +4634,7 @@
               </w:rPr>
               <w:t>Api.csproj</w:t>
             </w:r>
+            <w:proofErr w:type="spellEnd"/>
           </w:p>
         </w:tc>
         <w:tc>
@@ -4195,6 +4708,8 @@
                 <w14:ligatures w14:val="none"/>
               </w:rPr>
             </w:pPr>
+            <w:proofErr w:type="spellStart"/>
+            <w:proofErr w:type="gramStart"/>
             <w:r>
               <w:rPr>
                 <w:rFonts w:ascii="Aptos Narrow" w:eastAsia="Times New Roman" w:hAnsi="Aptos Narrow" w:cs="Times New Roman"/>
@@ -4207,6 +4722,8 @@
               </w:rPr>
               <w:t>appsettings.json</w:t>
             </w:r>
+            <w:proofErr w:type="spellEnd"/>
+            <w:proofErr w:type="gramEnd"/>
           </w:p>
         </w:tc>
         <w:tc>
@@ -4309,6 +4826,7 @@
                 <w14:ligatures w14:val="none"/>
               </w:rPr>
             </w:pPr>
+            <w:proofErr w:type="spellStart"/>
             <w:r>
               <w:rPr>
                 <w:rFonts w:ascii="Aptos Narrow" w:eastAsia="Times New Roman" w:hAnsi="Aptos Narrow" w:cs="Times New Roman"/>
@@ -4319,8 +4837,89 @@
                 <w:lang w:eastAsia="es-GT"/>
                 <w14:ligatures w14:val="none"/>
               </w:rPr>
-              <w:t>dotnet add package Microsoft.EntityFrameworkCore.Sqlite</w:t>
-            </w:r>
+              <w:t>dotnet</w:t>
+            </w:r>
+            <w:proofErr w:type="spellEnd"/>
+            <w:r>
+              <w:rPr>
+                <w:rFonts w:ascii="Aptos Narrow" w:eastAsia="Times New Roman" w:hAnsi="Aptos Narrow" w:cs="Times New Roman"/>
+                <w:color w:val="000000"/>
+                <w:kern w:val="0"/>
+                <w:sz w:val="22"/>
+                <w:szCs w:val="22"/>
+                <w:lang w:eastAsia="es-GT"/>
+                <w14:ligatures w14:val="none"/>
+              </w:rPr>
+              <w:t xml:space="preserve"> </w:t>
+            </w:r>
+            <w:proofErr w:type="spellStart"/>
+            <w:r>
+              <w:rPr>
+                <w:rFonts w:ascii="Aptos Narrow" w:eastAsia="Times New Roman" w:hAnsi="Aptos Narrow" w:cs="Times New Roman"/>
+                <w:color w:val="000000"/>
+                <w:kern w:val="0"/>
+                <w:sz w:val="22"/>
+                <w:szCs w:val="22"/>
+                <w:lang w:eastAsia="es-GT"/>
+                <w14:ligatures w14:val="none"/>
+              </w:rPr>
+              <w:t>add</w:t>
+            </w:r>
+            <w:proofErr w:type="spellEnd"/>
+            <w:r>
+              <w:rPr>
+                <w:rFonts w:ascii="Aptos Narrow" w:eastAsia="Times New Roman" w:hAnsi="Aptos Narrow" w:cs="Times New Roman"/>
+                <w:color w:val="000000"/>
+                <w:kern w:val="0"/>
+                <w:sz w:val="22"/>
+                <w:szCs w:val="22"/>
+                <w:lang w:eastAsia="es-GT"/>
+                <w14:ligatures w14:val="none"/>
+              </w:rPr>
+              <w:t xml:space="preserve"> </w:t>
+            </w:r>
+            <w:proofErr w:type="spellStart"/>
+            <w:r>
+              <w:rPr>
+                <w:rFonts w:ascii="Aptos Narrow" w:eastAsia="Times New Roman" w:hAnsi="Aptos Narrow" w:cs="Times New Roman"/>
+                <w:color w:val="000000"/>
+                <w:kern w:val="0"/>
+                <w:sz w:val="22"/>
+                <w:szCs w:val="22"/>
+                <w:lang w:eastAsia="es-GT"/>
+                <w14:ligatures w14:val="none"/>
+              </w:rPr>
+              <w:t>package</w:t>
+            </w:r>
+            <w:proofErr w:type="spellEnd"/>
+            <w:r>
+              <w:rPr>
+                <w:rFonts w:ascii="Aptos Narrow" w:eastAsia="Times New Roman" w:hAnsi="Aptos Narrow" w:cs="Times New Roman"/>
+                <w:color w:val="000000"/>
+                <w:kern w:val="0"/>
+                <w:sz w:val="22"/>
+                <w:szCs w:val="22"/>
+                <w:lang w:eastAsia="es-GT"/>
+                <w14:ligatures w14:val="none"/>
+              </w:rPr>
+              <w:t xml:space="preserve"> </w:t>
+            </w:r>
+            <w:proofErr w:type="spellStart"/>
+            <w:proofErr w:type="gramStart"/>
+            <w:r>
+              <w:rPr>
+                <w:rFonts w:ascii="Aptos Narrow" w:eastAsia="Times New Roman" w:hAnsi="Aptos Narrow" w:cs="Times New Roman"/>
+                <w:color w:val="000000"/>
+                <w:kern w:val="0"/>
+                <w:sz w:val="22"/>
+                <w:szCs w:val="22"/>
+                <w:lang w:eastAsia="es-GT"/>
+                <w14:ligatures w14:val="none"/>
+              </w:rPr>
+              <w:t>Microsoft.EntityFrameworkCore.Sqlite</w:t>
+            </w:r>
+            <w:proofErr w:type="spellEnd"/>
+            <w:proofErr w:type="gramEnd"/>
             <w:r>
               <w:rPr>
                 <w:rFonts w:ascii="Aptos Narrow" w:eastAsia="Times New Roman" w:hAnsi="Aptos Narrow" w:cs="Times New Roman"/>
@@ -4378,6 +4977,7 @@
                 <w14:ligatures w14:val="none"/>
               </w:rPr>
             </w:pPr>
+            <w:proofErr w:type="spellStart"/>
             <w:r>
               <w:rPr>
                 <w:rFonts w:ascii="Aptos Narrow" w:eastAsia="Times New Roman" w:hAnsi="Aptos Narrow" w:cs="Times New Roman"/>
@@ -4388,8 +4988,89 @@
                 <w:lang w:eastAsia="es-GT"/>
                 <w14:ligatures w14:val="none"/>
               </w:rPr>
-              <w:t>dotnet add package Microsoft.EntityFrameworkCore.Design</w:t>
-            </w:r>
+              <w:t>dotnet</w:t>
+            </w:r>
+            <w:proofErr w:type="spellEnd"/>
+            <w:r>
+              <w:rPr>
+                <w:rFonts w:ascii="Aptos Narrow" w:eastAsia="Times New Roman" w:hAnsi="Aptos Narrow" w:cs="Times New Roman"/>
+                <w:color w:val="000000"/>
+                <w:kern w:val="0"/>
+                <w:sz w:val="22"/>
+                <w:szCs w:val="22"/>
+                <w:lang w:eastAsia="es-GT"/>
+                <w14:ligatures w14:val="none"/>
+              </w:rPr>
+              <w:t xml:space="preserve"> </w:t>
+            </w:r>
+            <w:proofErr w:type="spellStart"/>
+            <w:r>
+              <w:rPr>
+                <w:rFonts w:ascii="Aptos Narrow" w:eastAsia="Times New Roman" w:hAnsi="Aptos Narrow" w:cs="Times New Roman"/>
+                <w:color w:val="000000"/>
+                <w:kern w:val="0"/>
+                <w:sz w:val="22"/>
+                <w:szCs w:val="22"/>
+                <w:lang w:eastAsia="es-GT"/>
+                <w14:ligatures w14:val="none"/>
+              </w:rPr>
+              <w:t>add</w:t>
+            </w:r>
+            <w:proofErr w:type="spellEnd"/>
+            <w:r>
+              <w:rPr>
+                <w:rFonts w:ascii="Aptos Narrow" w:eastAsia="Times New Roman" w:hAnsi="Aptos Narrow" w:cs="Times New Roman"/>
+                <w:color w:val="000000"/>
+                <w:kern w:val="0"/>
+                <w:sz w:val="22"/>
+                <w:szCs w:val="22"/>
+                <w:lang w:eastAsia="es-GT"/>
+                <w14:ligatures w14:val="none"/>
+              </w:rPr>
+              <w:t xml:space="preserve"> </w:t>
+            </w:r>
+            <w:proofErr w:type="spellStart"/>
+            <w:r>
+              <w:rPr>
+                <w:rFonts w:ascii="Aptos Narrow" w:eastAsia="Times New Roman" w:hAnsi="Aptos Narrow" w:cs="Times New Roman"/>
+                <w:color w:val="000000"/>
+                <w:kern w:val="0"/>
+                <w:sz w:val="22"/>
+                <w:szCs w:val="22"/>
+                <w:lang w:eastAsia="es-GT"/>
+                <w14:ligatures w14:val="none"/>
+              </w:rPr>
+              <w:t>package</w:t>
+            </w:r>
+            <w:proofErr w:type="spellEnd"/>
+            <w:r>
+              <w:rPr>
+                <w:rFonts w:ascii="Aptos Narrow" w:eastAsia="Times New Roman" w:hAnsi="Aptos Narrow" w:cs="Times New Roman"/>
+                <w:color w:val="000000"/>
+                <w:kern w:val="0"/>
+                <w:sz w:val="22"/>
+                <w:szCs w:val="22"/>
+                <w:lang w:eastAsia="es-GT"/>
+                <w14:ligatures w14:val="none"/>
+              </w:rPr>
+              <w:t xml:space="preserve"> </w:t>
+            </w:r>
+            <w:proofErr w:type="spellStart"/>
+            <w:proofErr w:type="gramStart"/>
+            <w:r>
+              <w:rPr>
+                <w:rFonts w:ascii="Aptos Narrow" w:eastAsia="Times New Roman" w:hAnsi="Aptos Narrow" w:cs="Times New Roman"/>
+                <w:color w:val="000000"/>
+                <w:kern w:val="0"/>
+                <w:sz w:val="22"/>
+                <w:szCs w:val="22"/>
+                <w:lang w:eastAsia="es-GT"/>
+                <w14:ligatures w14:val="none"/>
+              </w:rPr>
+              <w:t>Microsoft.EntityFrameworkCore.Design</w:t>
+            </w:r>
+            <w:proofErr w:type="spellEnd"/>
+            <w:proofErr w:type="gramEnd"/>
           </w:p>
         </w:tc>
       </w:tr>
@@ -4433,8 +5114,22 @@
                 <w:lang w:val="en-US" w:eastAsia="es-GT"/>
                 <w14:ligatures w14:val="none"/>
               </w:rPr>
-              <w:t>dotnet add package Swashbuckle.AspNetCore</w:t>
-            </w:r>
+              <w:t xml:space="preserve">dotnet add package </w:t>
+            </w:r>
+            <w:proofErr w:type="spellStart"/>
+            <w:r>
+              <w:rPr>
+                <w:rFonts w:ascii="Aptos Narrow" w:eastAsia="Times New Roman" w:hAnsi="Aptos Narrow" w:cs="Times New Roman"/>
+                <w:color w:val="000000"/>
+                <w:kern w:val="0"/>
+                <w:sz w:val="22"/>
+                <w:szCs w:val="22"/>
+                <w:lang w:val="en-US" w:eastAsia="es-GT"/>
+                <w14:ligatures w14:val="none"/>
+              </w:rPr>
+              <w:t>Swashbuckle.AspNetCore</w:t>
+            </w:r>
+            <w:proofErr w:type="spellEnd"/>
           </w:p>
         </w:tc>
       </w:tr>
@@ -4513,6 +5208,7 @@
                 <w14:ligatures w14:val="none"/>
               </w:rPr>
             </w:pPr>
+            <w:proofErr w:type="spellStart"/>
             <w:r>
               <w:rPr>
                 <w:rFonts w:ascii="Aptos Narrow" w:eastAsia="Times New Roman" w:hAnsi="Aptos Narrow" w:cs="Times New Roman"/>
@@ -4523,8 +5219,89 @@
                 <w:lang w:eastAsia="es-GT"/>
                 <w14:ligatures w14:val="none"/>
               </w:rPr>
-              <w:t>dotnet add package Microsoft.AspNetCore.Authentication.JwtBearer</w:t>
-            </w:r>
+              <w:t>dotnet</w:t>
+            </w:r>
+            <w:proofErr w:type="spellEnd"/>
+            <w:r>
+              <w:rPr>
+                <w:rFonts w:ascii="Aptos Narrow" w:eastAsia="Times New Roman" w:hAnsi="Aptos Narrow" w:cs="Times New Roman"/>
+                <w:color w:val="000000"/>
+                <w:kern w:val="0"/>
+                <w:sz w:val="22"/>
+                <w:szCs w:val="22"/>
+                <w:lang w:eastAsia="es-GT"/>
+                <w14:ligatures w14:val="none"/>
+              </w:rPr>
+              <w:t xml:space="preserve"> </w:t>
+            </w:r>
+            <w:proofErr w:type="spellStart"/>
+            <w:r>
+              <w:rPr>
+                <w:rFonts w:ascii="Aptos Narrow" w:eastAsia="Times New Roman" w:hAnsi="Aptos Narrow" w:cs="Times New Roman"/>
+                <w:color w:val="000000"/>
+                <w:kern w:val="0"/>
+                <w:sz w:val="22"/>
+                <w:szCs w:val="22"/>
+                <w:lang w:eastAsia="es-GT"/>
+                <w14:ligatures w14:val="none"/>
+              </w:rPr>
+              <w:t>add</w:t>
+            </w:r>
+            <w:proofErr w:type="spellEnd"/>
+            <w:r>
+              <w:rPr>
+                <w:rFonts w:ascii="Aptos Narrow" w:eastAsia="Times New Roman" w:hAnsi="Aptos Narrow" w:cs="Times New Roman"/>
+                <w:color w:val="000000"/>
+                <w:kern w:val="0"/>
+                <w:sz w:val="22"/>
+                <w:szCs w:val="22"/>
+                <w:lang w:eastAsia="es-GT"/>
+                <w14:ligatures w14:val="none"/>
+              </w:rPr>
+              <w:t xml:space="preserve"> </w:t>
+            </w:r>
+            <w:proofErr w:type="spellStart"/>
+            <w:r>
+              <w:rPr>
+                <w:rFonts w:ascii="Aptos Narrow" w:eastAsia="Times New Roman" w:hAnsi="Aptos Narrow" w:cs="Times New Roman"/>
+                <w:color w:val="000000"/>
+                <w:kern w:val="0"/>
+                <w:sz w:val="22"/>
+                <w:szCs w:val="22"/>
+                <w:lang w:eastAsia="es-GT"/>
+                <w14:ligatures w14:val="none"/>
+              </w:rPr>
+              <w:t>package</w:t>
+            </w:r>
+            <w:proofErr w:type="spellEnd"/>
+            <w:r>
+              <w:rPr>
+                <w:rFonts w:ascii="Aptos Narrow" w:eastAsia="Times New Roman" w:hAnsi="Aptos Narrow" w:cs="Times New Roman"/>
+                <w:color w:val="000000"/>
+                <w:kern w:val="0"/>
+                <w:sz w:val="22"/>
+                <w:szCs w:val="22"/>
+                <w:lang w:eastAsia="es-GT"/>
+                <w14:ligatures w14:val="none"/>
+              </w:rPr>
+              <w:t xml:space="preserve"> </w:t>
+            </w:r>
+            <w:proofErr w:type="spellStart"/>
+            <w:proofErr w:type="gramStart"/>
+            <w:r>
+              <w:rPr>
+                <w:rFonts w:ascii="Aptos Narrow" w:eastAsia="Times New Roman" w:hAnsi="Aptos Narrow" w:cs="Times New Roman"/>
+                <w:color w:val="000000"/>
+                <w:kern w:val="0"/>
+                <w:sz w:val="22"/>
+                <w:szCs w:val="22"/>
+                <w:lang w:eastAsia="es-GT"/>
+                <w14:ligatures w14:val="none"/>
+              </w:rPr>
+              <w:t>Microsoft.AspNetCore.Authentication.JwtBearer</w:t>
+            </w:r>
+            <w:proofErr w:type="spellEnd"/>
+            <w:proofErr w:type="gramEnd"/>
           </w:p>
         </w:tc>
       </w:tr>
@@ -4536,6 +5313,476 @@
           <w:bCs/>
         </w:rPr>
       </w:pPr>
+    </w:p>
+    <w:p>
+      <w:pPr>
+        <w:rPr>
+          <w:rFonts w:ascii="Arial" w:hAnsi="Arial" w:cs="Arial"/>
+          <w:bCs/>
+        </w:rPr>
+      </w:pPr>
+      <w:r>
+        <w:rPr>
+          <w:rFonts w:ascii="Arial" w:hAnsi="Arial" w:cs="Arial"/>
+          <w:bCs/>
+        </w:rPr>
+        <w:t xml:space="preserve">Validaciones, con </w:t>
+      </w:r>
+      <w:proofErr w:type="gramStart"/>
+      <w:r>
+        <w:rPr>
+          <w:rFonts w:ascii="Arial" w:hAnsi="Arial" w:cs="Arial"/>
+          <w:bCs/>
+        </w:rPr>
+        <w:t>las importación</w:t>
+      </w:r>
+      <w:proofErr w:type="gramEnd"/>
+      <w:r>
+        <w:rPr>
+          <w:rFonts w:ascii="Arial" w:hAnsi="Arial" w:cs="Arial"/>
+          <w:bCs/>
+        </w:rPr>
+        <w:t xml:space="preserve"> de paquetes se tuvo que forzar que se descargaran para la versión 8 </w:t>
+      </w:r>
+      <w:proofErr w:type="gramStart"/>
+      <w:r>
+        <w:rPr>
+          <w:rFonts w:ascii="Arial" w:hAnsi="Arial" w:cs="Arial"/>
+          <w:bCs/>
+        </w:rPr>
+        <w:t>.net ,</w:t>
+      </w:r>
+      <w:proofErr w:type="gramEnd"/>
+      <w:r>
+        <w:rPr>
+          <w:rFonts w:ascii="Arial" w:hAnsi="Arial" w:cs="Arial"/>
+          <w:bCs/>
+        </w:rPr>
+        <w:t xml:space="preserve"> el sistema reconoce la mas reciente y nos restauraba por temas de compatibilidad.</w:t>
+      </w:r>
+    </w:p>
+    <w:p>
+      <w:pPr>
+        <w:rPr>
+          <w:rFonts w:ascii="Arial" w:hAnsi="Arial" w:cs="Arial"/>
+          <w:bCs/>
+        </w:rPr>
+      </w:pPr>
+    </w:p>
+    <w:p>
+      <w:pPr>
+        <w:rPr>
+          <w:rFonts w:ascii="Arial" w:hAnsi="Arial" w:cs="Arial"/>
+          <w:bCs/>
+        </w:rPr>
+      </w:pPr>
+      <w:proofErr w:type="spellStart"/>
+      <w:r>
+        <w:rPr>
+          <w:rFonts w:ascii="Arial" w:hAnsi="Arial" w:cs="Arial"/>
+          <w:bCs/>
+        </w:rPr>
+        <w:t>Gitignore</w:t>
+      </w:r>
+      <w:proofErr w:type="spellEnd"/>
+      <w:r>
+        <w:rPr>
+          <w:rFonts w:ascii="Arial" w:hAnsi="Arial" w:cs="Arial"/>
+          <w:bCs/>
+        </w:rPr>
+        <w:t xml:space="preserve"> – se </w:t>
+      </w:r>
+      <w:proofErr w:type="spellStart"/>
+      <w:r>
+        <w:rPr>
+          <w:rFonts w:ascii="Arial" w:hAnsi="Arial" w:cs="Arial"/>
+          <w:bCs/>
+        </w:rPr>
+        <w:t>valido</w:t>
+      </w:r>
+      <w:proofErr w:type="spellEnd"/>
+      <w:r>
+        <w:rPr>
+          <w:rFonts w:ascii="Arial" w:hAnsi="Arial" w:cs="Arial"/>
+          <w:bCs/>
+        </w:rPr>
+        <w:t xml:space="preserve"> que carpetas no </w:t>
+      </w:r>
+      <w:r>
+        <w:rPr>
+          <w:rFonts w:ascii="Arial" w:hAnsi="Arial" w:cs="Arial"/>
+          <w:bCs/>
+        </w:rPr>
+        <w:t xml:space="preserve">utilizaría </w:t>
+      </w:r>
+      <w:proofErr w:type="spellStart"/>
+      <w:r>
+        <w:rPr>
+          <w:rFonts w:ascii="Arial" w:hAnsi="Arial" w:cs="Arial"/>
+          <w:bCs/>
+        </w:rPr>
+        <w:t>git</w:t>
+      </w:r>
+      <w:proofErr w:type="spellEnd"/>
+      <w:r>
+        <w:rPr>
+          <w:rFonts w:ascii="Arial" w:hAnsi="Arial" w:cs="Arial"/>
+          <w:bCs/>
+        </w:rPr>
+        <w:t xml:space="preserve"> para subirlas al repositorio, se </w:t>
+      </w:r>
+      <w:proofErr w:type="spellStart"/>
+      <w:r>
+        <w:rPr>
+          <w:rFonts w:ascii="Arial" w:hAnsi="Arial" w:cs="Arial"/>
+          <w:bCs/>
+        </w:rPr>
+        <w:t>realizo</w:t>
+      </w:r>
+      <w:proofErr w:type="spellEnd"/>
+      <w:r>
+        <w:rPr>
+          <w:rFonts w:ascii="Arial" w:hAnsi="Arial" w:cs="Arial"/>
+          <w:bCs/>
+        </w:rPr>
+        <w:t xml:space="preserve"> </w:t>
+      </w:r>
+      <w:proofErr w:type="gramStart"/>
+      <w:r>
+        <w:rPr>
+          <w:rFonts w:ascii="Arial" w:hAnsi="Arial" w:cs="Arial"/>
+          <w:bCs/>
+        </w:rPr>
+        <w:t>un investigación</w:t>
+      </w:r>
+      <w:proofErr w:type="gramEnd"/>
+      <w:r>
+        <w:rPr>
+          <w:rFonts w:ascii="Arial" w:hAnsi="Arial" w:cs="Arial"/>
+          <w:bCs/>
+        </w:rPr>
+        <w:t xml:space="preserve"> o bien cuestionamiento de a que se refería y si </w:t>
+      </w:r>
+      <w:proofErr w:type="gramStart"/>
+      <w:r>
+        <w:rPr>
+          <w:rFonts w:ascii="Arial" w:hAnsi="Arial" w:cs="Arial"/>
+          <w:bCs/>
+        </w:rPr>
+        <w:t>tendríamos</w:t>
+      </w:r>
+      <w:proofErr w:type="gramEnd"/>
+      <w:r>
+        <w:rPr>
+          <w:rFonts w:ascii="Arial" w:hAnsi="Arial" w:cs="Arial"/>
+          <w:bCs/>
+        </w:rPr>
+        <w:t xml:space="preserve"> algún problema por el cual no se subirían esos archivos.</w:t>
+      </w:r>
+    </w:p>
+    <w:p>
+      <w:pPr>
+        <w:rPr>
+          <w:rFonts w:ascii="Arial" w:hAnsi="Arial" w:cs="Arial"/>
+          <w:bCs/>
+        </w:rPr>
+      </w:pPr>
+    </w:p>
+    <w:p>
+      <w:pPr>
+        <w:rPr>
+          <w:rFonts w:ascii="Arial" w:hAnsi="Arial" w:cs="Arial"/>
+          <w:bCs/>
+        </w:rPr>
+      </w:pPr>
+      <w:r>
+        <w:rPr>
+          <w:rFonts w:ascii="Arial" w:hAnsi="Arial" w:cs="Arial"/>
+          <w:bCs/>
+        </w:rPr>
+        <w:lastRenderedPageBreak/>
+        <w:t>Paso 1</w:t>
+      </w:r>
+    </w:p>
+    <w:p>
+      <w:pPr>
+        <w:numPr>
+          <w:ilvl w:val="0"/>
+          <w:numId w:val="3"/>
+        </w:numPr>
+        <w:rPr>
+          <w:rFonts w:ascii="Arial" w:hAnsi="Arial" w:cs="Arial"/>
+          <w:bCs/>
+        </w:rPr>
+      </w:pPr>
+      <w:r>
+        <w:rPr>
+          <w:rFonts w:ascii="Arial" w:hAnsi="Arial" w:cs="Arial"/>
+          <w:b/>
+          <w:bCs/>
+        </w:rPr>
+        <w:t>Modelo de datos + EF Core + semilla.</w:t>
+      </w:r>
+      <w:r>
+        <w:rPr>
+          <w:rFonts w:ascii="Arial" w:hAnsi="Arial" w:cs="Arial"/>
+          <w:bCs/>
+        </w:rPr>
+        <w:t> Verifica con Swagger que puedes leer datos antes de seguir.</w:t>
+      </w:r>
+    </w:p>
+    <w:p>
+      <w:pPr>
+        <w:rPr>
+          <w:rFonts w:ascii="Arial" w:hAnsi="Arial" w:cs="Arial"/>
+          <w:bCs/>
+        </w:rPr>
+      </w:pPr>
+      <w:r>
+        <w:rPr>
+          <w:rFonts w:ascii="Arial" w:hAnsi="Arial" w:cs="Arial"/>
+          <w:bCs/>
+        </w:rPr>
+        <w:t>Se siguió el orden de trabajo sugerido para no tener inconvenientes con el tiempo y poder investigar el lenguaje, entender su estructura y palabras reservadas, como declarar</w:t>
+      </w:r>
+      <w:r>
+        <w:rPr>
+          <w:rFonts w:ascii="Arial" w:hAnsi="Arial" w:cs="Arial"/>
+          <w:bCs/>
+        </w:rPr>
+        <w:t xml:space="preserve"> variables</w:t>
+      </w:r>
+      <w:r>
+        <w:rPr>
+          <w:rFonts w:ascii="Arial" w:hAnsi="Arial" w:cs="Arial"/>
+          <w:bCs/>
+        </w:rPr>
+        <w:t xml:space="preserve"> y </w:t>
+      </w:r>
+      <w:r>
+        <w:rPr>
+          <w:rFonts w:ascii="Arial" w:hAnsi="Arial" w:cs="Arial"/>
+          <w:bCs/>
+        </w:rPr>
+        <w:t>sus funciones principales</w:t>
+      </w:r>
+      <w:r>
+        <w:rPr>
+          <w:rFonts w:ascii="Arial" w:hAnsi="Arial" w:cs="Arial"/>
+          <w:bCs/>
+        </w:rPr>
+        <w:t xml:space="preserve"> que en este .net es muy flexible y adaptable dependiente que es lo que necesitamos desarrollar.</w:t>
+      </w:r>
+    </w:p>
+    <w:p>
+      <w:pPr>
+        <w:rPr>
+          <w:rFonts w:ascii="Arial" w:hAnsi="Arial" w:cs="Arial"/>
+          <w:bCs/>
+        </w:rPr>
+      </w:pPr>
+      <w:r>
+        <w:rPr>
+          <w:rFonts w:ascii="Arial" w:hAnsi="Arial" w:cs="Arial"/>
+          <w:bCs/>
+        </w:rPr>
+        <w:t xml:space="preserve">El Swagger y </w:t>
+      </w:r>
+      <w:r>
+        <w:rPr>
+          <w:rFonts w:ascii="Arial" w:hAnsi="Arial" w:cs="Arial"/>
+          <w:bCs/>
+        </w:rPr>
+        <w:t>SQLite</w:t>
+      </w:r>
+      <w:r>
+        <w:rPr>
+          <w:rFonts w:ascii="Arial" w:hAnsi="Arial" w:cs="Arial"/>
+          <w:bCs/>
+        </w:rPr>
+        <w:t xml:space="preserve">, ya </w:t>
+      </w:r>
+      <w:r>
+        <w:rPr>
+          <w:rFonts w:ascii="Arial" w:hAnsi="Arial" w:cs="Arial"/>
+          <w:bCs/>
+        </w:rPr>
+        <w:t>tenía</w:t>
+      </w:r>
+      <w:r>
+        <w:rPr>
+          <w:rFonts w:ascii="Arial" w:hAnsi="Arial" w:cs="Arial"/>
+          <w:bCs/>
+        </w:rPr>
+        <w:t xml:space="preserve"> comunicación con el </w:t>
+      </w:r>
+      <w:proofErr w:type="gramStart"/>
+      <w:r>
+        <w:rPr>
+          <w:rFonts w:ascii="Arial" w:hAnsi="Arial" w:cs="Arial"/>
+          <w:bCs/>
+        </w:rPr>
+        <w:t>api</w:t>
+      </w:r>
+      <w:proofErr w:type="gramEnd"/>
+      <w:r>
+        <w:rPr>
+          <w:rFonts w:ascii="Arial" w:hAnsi="Arial" w:cs="Arial"/>
+          <w:bCs/>
+        </w:rPr>
+        <w:t xml:space="preserve"> pero no con el archivo donde tendríamos nuestros datos de prueba, dado a que </w:t>
+      </w:r>
+      <w:r>
+        <w:rPr>
+          <w:rFonts w:ascii="Arial" w:hAnsi="Arial" w:cs="Arial"/>
+          <w:bCs/>
+        </w:rPr>
+        <w:t>realice</w:t>
+      </w:r>
+      <w:r>
+        <w:rPr>
+          <w:rFonts w:ascii="Arial" w:hAnsi="Arial" w:cs="Arial"/>
+          <w:bCs/>
+        </w:rPr>
+        <w:t xml:space="preserve"> </w:t>
+      </w:r>
+      <w:r>
+        <w:rPr>
+          <w:rFonts w:ascii="Arial" w:hAnsi="Arial" w:cs="Arial"/>
+          <w:bCs/>
+        </w:rPr>
+        <w:t>en la terminal</w:t>
+      </w:r>
+      <w:r>
+        <w:rPr>
+          <w:rFonts w:ascii="Arial" w:hAnsi="Arial" w:cs="Arial"/>
+          <w:bCs/>
+        </w:rPr>
+        <w:t xml:space="preserve"> </w:t>
+      </w:r>
+      <w:proofErr w:type="spellStart"/>
+      <w:r>
+        <w:rPr>
+          <w:rFonts w:ascii="Arial" w:hAnsi="Arial" w:cs="Arial"/>
+          <w:b/>
+        </w:rPr>
+        <w:t>dotnet</w:t>
+      </w:r>
+      <w:proofErr w:type="spellEnd"/>
+      <w:r>
+        <w:rPr>
+          <w:rFonts w:ascii="Arial" w:hAnsi="Arial" w:cs="Arial"/>
+          <w:b/>
+        </w:rPr>
+        <w:t xml:space="preserve"> run</w:t>
+      </w:r>
+      <w:r>
+        <w:rPr>
+          <w:rFonts w:ascii="Arial" w:hAnsi="Arial" w:cs="Arial"/>
+          <w:bCs/>
+        </w:rPr>
+        <w:t xml:space="preserve"> antes de tiempo, luego no me </w:t>
+      </w:r>
+      <w:r>
+        <w:rPr>
+          <w:rFonts w:ascii="Arial" w:hAnsi="Arial" w:cs="Arial"/>
+          <w:bCs/>
+        </w:rPr>
+        <w:t>reconoció</w:t>
+      </w:r>
+      <w:r>
+        <w:rPr>
+          <w:rFonts w:ascii="Arial" w:hAnsi="Arial" w:cs="Arial"/>
+          <w:bCs/>
+        </w:rPr>
+        <w:t xml:space="preserve"> el archivo o bien se creo incorrectamente se tuvo que eliminar los archivos </w:t>
+      </w:r>
+      <w:proofErr w:type="spellStart"/>
+      <w:r>
+        <w:rPr>
+          <w:rFonts w:ascii="Arial" w:hAnsi="Arial" w:cs="Arial"/>
+          <w:bCs/>
+        </w:rPr>
+        <w:t>db</w:t>
+      </w:r>
+      <w:proofErr w:type="spellEnd"/>
+      <w:r>
+        <w:rPr>
+          <w:rFonts w:ascii="Arial" w:hAnsi="Arial" w:cs="Arial"/>
+          <w:bCs/>
+        </w:rPr>
+        <w:t xml:space="preserve"> y se realizo de nuevo, pero en el orden correcto </w:t>
+      </w:r>
+      <w:proofErr w:type="spellStart"/>
+      <w:r>
+        <w:rPr>
+          <w:rFonts w:ascii="Arial" w:hAnsi="Arial" w:cs="Arial"/>
+          <w:b/>
+        </w:rPr>
+        <w:t>dotnet</w:t>
+      </w:r>
+      <w:proofErr w:type="spellEnd"/>
+      <w:r>
+        <w:rPr>
+          <w:rFonts w:ascii="Arial" w:hAnsi="Arial" w:cs="Arial"/>
+          <w:b/>
+        </w:rPr>
+        <w:t xml:space="preserve"> </w:t>
+      </w:r>
+      <w:proofErr w:type="spellStart"/>
+      <w:r>
+        <w:rPr>
+          <w:rFonts w:ascii="Arial" w:hAnsi="Arial" w:cs="Arial"/>
+          <w:b/>
+        </w:rPr>
+        <w:t>build</w:t>
+      </w:r>
+      <w:proofErr w:type="spellEnd"/>
+      <w:r>
+        <w:rPr>
+          <w:rFonts w:ascii="Arial" w:hAnsi="Arial" w:cs="Arial"/>
+          <w:bCs/>
+        </w:rPr>
+        <w:t xml:space="preserve"> para compilar el código y luego </w:t>
+      </w:r>
+      <w:proofErr w:type="spellStart"/>
+      <w:r>
+        <w:rPr>
+          <w:rFonts w:ascii="Arial" w:hAnsi="Arial" w:cs="Arial"/>
+          <w:b/>
+        </w:rPr>
+        <w:t>dotnet</w:t>
+      </w:r>
+      <w:proofErr w:type="spellEnd"/>
+      <w:r>
+        <w:rPr>
+          <w:rFonts w:ascii="Arial" w:hAnsi="Arial" w:cs="Arial"/>
+          <w:b/>
+        </w:rPr>
+        <w:t xml:space="preserve"> run</w:t>
+      </w:r>
+      <w:r>
+        <w:rPr>
+          <w:rFonts w:ascii="Arial" w:hAnsi="Arial" w:cs="Arial"/>
+          <w:bCs/>
+        </w:rPr>
+        <w:t xml:space="preserve"> para compilar y ejecutar la aplicación </w:t>
+      </w:r>
+    </w:p>
+    <w:p>
+      <w:pPr>
+        <w:rPr>
+          <w:rFonts w:ascii="Arial" w:hAnsi="Arial" w:cs="Arial"/>
+          <w:bCs/>
+        </w:rPr>
+      </w:pPr>
+      <w:r>
+        <w:rPr>
+          <w:rFonts w:ascii="Arial" w:hAnsi="Arial" w:cs="Arial"/>
+          <w:bCs/>
+        </w:rPr>
+        <w:t>Error que no me dejaba pasar, Microsoft Open api no estaba instalado la versión correcta, después de varios intentos se limpio la versión y se reinstalo la versión 6.5.0, para que nos dejara compilar</w:t>
+      </w:r>
     </w:p>
     <w:p>
       <w:pPr>
@@ -4796,11 +6043,127 @@
       </w:rPr>
     </w:lvl>
   </w:abstractNum>
+  <w:abstractNum w:abstractNumId="2" w15:restartNumberingAfterBreak="0">
+    <w:nsid w:val="5C1433F6"/>
+    <w:multiLevelType w:val="multilevel"/>
+    <w:tmpl w:val="536A9274"/>
+    <w:lvl w:ilvl="0">
+      <w:start w:val="1"/>
+      <w:numFmt w:val="decimal"/>
+      <w:lvlText w:val="%1."/>
+      <w:lvlJc w:val="left"/>
+      <w:pPr>
+        <w:tabs>
+          <w:tab w:val="num" w:pos="720"/>
+        </w:tabs>
+        <w:ind w:left="720" w:hanging="360"/>
+      </w:pPr>
+    </w:lvl>
+    <w:lvl w:ilvl="1" w:tentative="1">
+      <w:start w:val="1"/>
+      <w:numFmt w:val="decimal"/>
+      <w:lvlText w:val="%2."/>
+      <w:lvlJc w:val="left"/>
+      <w:pPr>
+        <w:tabs>
+          <w:tab w:val="num" w:pos="1440"/>
+        </w:tabs>
+        <w:ind w:left="1440" w:hanging="360"/>
+      </w:pPr>
+    </w:lvl>
+    <w:lvl w:ilvl="2" w:tentative="1">
+      <w:start w:val="1"/>
+      <w:numFmt w:val="decimal"/>
+      <w:lvlText w:val="%3."/>
+      <w:lvlJc w:val="left"/>
+      <w:pPr>
+        <w:tabs>
+          <w:tab w:val="num" w:pos="2160"/>
+        </w:tabs>
+        <w:ind w:left="2160" w:hanging="360"/>
+      </w:pPr>
+    </w:lvl>
+    <w:lvl w:ilvl="3" w:tentative="1">
+      <w:start w:val="1"/>
+      <w:numFmt w:val="decimal"/>
+      <w:lvlText w:val="%4."/>
+      <w:lvlJc w:val="left"/>
+      <w:pPr>
+        <w:tabs>
+          <w:tab w:val="num" w:pos="2880"/>
+        </w:tabs>
+        <w:ind w:left="2880" w:hanging="360"/>
+      </w:pPr>
+    </w:lvl>
+    <w:lvl w:ilvl="4" w:tentative="1">
+      <w:start w:val="1"/>
+      <w:numFmt w:val="decimal"/>
+      <w:lvlText w:val="%5."/>
+      <w:lvlJc w:val="left"/>
+      <w:pPr>
+        <w:tabs>
+          <w:tab w:val="num" w:pos="3600"/>
+        </w:tabs>
+        <w:ind w:left="3600" w:hanging="360"/>
+      </w:pPr>
+    </w:lvl>
+    <w:lvl w:ilvl="5" w:tentative="1">
+      <w:start w:val="1"/>
+      <w:numFmt w:val="decimal"/>
+      <w:lvlText w:val="%6."/>
+      <w:lvlJc w:val="left"/>
+      <w:pPr>
+        <w:tabs>
+          <w:tab w:val="num" w:pos="4320"/>
+        </w:tabs>
+        <w:ind w:left="4320" w:hanging="360"/>
+      </w:pPr>
+    </w:lvl>
+    <w:lvl w:ilvl="6" w:tentative="1">
+      <w:start w:val="1"/>
+      <w:numFmt w:val="decimal"/>
+      <w:lvlText w:val="%7."/>
+      <w:lvlJc w:val="left"/>
+      <w:pPr>
+        <w:tabs>
+          <w:tab w:val="num" w:pos="5040"/>
+        </w:tabs>
+        <w:ind w:left="5040" w:hanging="360"/>
+      </w:pPr>
+    </w:lvl>
+    <w:lvl w:ilvl="7" w:tentative="1">
+      <w:start w:val="1"/>
+      <w:numFmt w:val="decimal"/>
+      <w:lvlText w:val="%8."/>
+      <w:lvlJc w:val="left"/>
+      <w:pPr>
+        <w:tabs>
+          <w:tab w:val="num" w:pos="5760"/>
+        </w:tabs>
+        <w:ind w:left="5760" w:hanging="360"/>
+      </w:pPr>
+    </w:lvl>
+    <w:lvl w:ilvl="8" w:tentative="1">
+      <w:start w:val="1"/>
+      <w:numFmt w:val="decimal"/>
+      <w:lvlText w:val="%9."/>
+      <w:lvlJc w:val="left"/>
+      <w:pPr>
+        <w:tabs>
+          <w:tab w:val="num" w:pos="6480"/>
+        </w:tabs>
+        <w:ind w:left="6480" w:hanging="360"/>
+      </w:pPr>
+    </w:lvl>
+  </w:abstractNum>
   <w:num w:numId="1" w16cid:durableId="1331175260">
     <w:abstractNumId w:val="0"/>
   </w:num>
   <w:num w:numId="2" w16cid:durableId="1994874274">
     <w:abstractNumId w:val="1"/>
+  </w:num>
+  <w:num w:numId="3" w16cid:durableId="1923366902">
+    <w:abstractNumId w:val="2"/>
   </w:num>
 </w:numbering>
 </file>

</xml_diff>